<commit_message>
Updated To Version 2
</commit_message>
<xml_diff>
--- a/Renault 5 HA Card User Guide V1.docx
+++ b/Renault 5 HA Card User Guide V1.docx
@@ -103,7 +103,7 @@
           <w:szCs w:val="36"/>
           <w:u w:val="single"/>
         </w:rPr>
-        <w:t>1</w:t>
+        <w:t>2</w:t>
       </w:r>
       <w:r>
         <w:rPr>
@@ -322,7 +322,7 @@
         <w:pStyle w:val="ListParagraph"/>
         <w:numPr>
           <w:ilvl w:val="0"/>
-          <w:numId w:val="25"/>
+          <w:numId w:val="28"/>
         </w:numPr>
         <w:jc w:val="both"/>
         <w:rPr>
@@ -336,6 +336,133 @@
           <w:szCs w:val="36"/>
         </w:rPr>
         <w:lastRenderedPageBreak/>
+        <w:t>Dynamic Charge Indicator</w:t>
+      </w:r>
+    </w:p>
+    <w:p>
+      <w:pPr>
+        <w:ind w:left="360"/>
+        <w:jc w:val="both"/>
+        <w:rPr>
+          <w:sz w:val="36"/>
+          <w:szCs w:val="36"/>
+        </w:rPr>
+      </w:pPr>
+      <w:r>
+        <w:rPr>
+          <w:sz w:val="36"/>
+          <w:szCs w:val="36"/>
+        </w:rPr>
+        <w:t>W</w:t>
+      </w:r>
+      <w:r>
+        <w:rPr>
+          <w:sz w:val="36"/>
+          <w:szCs w:val="36"/>
+        </w:rPr>
+        <w:t xml:space="preserve">hen an active charge session </w:t>
+      </w:r>
+      <w:r>
+        <w:rPr>
+          <w:sz w:val="36"/>
+          <w:szCs w:val="36"/>
+        </w:rPr>
+        <w:t>is detected</w:t>
+      </w:r>
+      <w:r>
+        <w:rPr>
+          <w:sz w:val="36"/>
+          <w:szCs w:val="36"/>
+        </w:rPr>
+        <w:t>, the main car image in the “Vehicle Status” section, is automatically replaced by a charge indicator, that dynamically displays the charge level (Current SOC) and the charge limits set (Min/Target SOC). Once charging has ended, the card disappears and the main car image replaces it.</w:t>
+      </w:r>
+    </w:p>
+    <w:p>
+      <w:pPr>
+        <w:ind w:left="360"/>
+        <w:jc w:val="both"/>
+        <w:rPr>
+          <w:sz w:val="36"/>
+          <w:szCs w:val="36"/>
+        </w:rPr>
+      </w:pPr>
+      <w:r>
+        <w:rPr>
+          <w:noProof/>
+          <w:sz w:val="36"/>
+          <w:szCs w:val="36"/>
+        </w:rPr>
+        <w:drawing>
+          <wp:inline distT="0" distB="0" distL="0" distR="0" wp14:anchorId="608D0D88" wp14:editId="2210BFE0">
+            <wp:extent cx="5581650" cy="3126205"/>
+            <wp:effectExtent l="0" t="0" r="0" b="0"/>
+            <wp:docPr id="767751146" name="Picture 2"/>
+            <wp:cNvGraphicFramePr>
+              <a:graphicFrameLocks xmlns:a="http://schemas.openxmlformats.org/drawingml/2006/main" noChangeAspect="1"/>
+            </wp:cNvGraphicFramePr>
+            <a:graphic xmlns:a="http://schemas.openxmlformats.org/drawingml/2006/main">
+              <a:graphicData uri="http://schemas.openxmlformats.org/drawingml/2006/picture">
+                <pic:pic xmlns:pic="http://schemas.openxmlformats.org/drawingml/2006/picture">
+                  <pic:nvPicPr>
+                    <pic:cNvPr id="767751146" name="Picture 767751146"/>
+                    <pic:cNvPicPr/>
+                  </pic:nvPicPr>
+                  <pic:blipFill>
+                    <a:blip r:embed="rId6">
+                      <a:extLst>
+                        <a:ext uri="{28A0092B-C50C-407E-A947-70E740481C1C}">
+                          <a14:useLocalDpi xmlns:a14="http://schemas.microsoft.com/office/drawing/2010/main" val="0"/>
+                        </a:ext>
+                      </a:extLst>
+                    </a:blip>
+                    <a:stretch>
+                      <a:fillRect/>
+                    </a:stretch>
+                  </pic:blipFill>
+                  <pic:spPr>
+                    <a:xfrm>
+                      <a:off x="0" y="0"/>
+                      <a:ext cx="5640209" cy="3159003"/>
+                    </a:xfrm>
+                    <a:prstGeom prst="rect">
+                      <a:avLst/>
+                    </a:prstGeom>
+                  </pic:spPr>
+                </pic:pic>
+              </a:graphicData>
+            </a:graphic>
+          </wp:inline>
+        </w:drawing>
+      </w:r>
+    </w:p>
+    <w:p>
+      <w:pPr>
+        <w:ind w:left="360"/>
+        <w:jc w:val="both"/>
+        <w:rPr>
+          <w:sz w:val="36"/>
+          <w:szCs w:val="36"/>
+        </w:rPr>
+      </w:pPr>
+    </w:p>
+    <w:p>
+      <w:pPr>
+        <w:pStyle w:val="ListParagraph"/>
+        <w:numPr>
+          <w:ilvl w:val="0"/>
+          <w:numId w:val="27"/>
+        </w:numPr>
+        <w:jc w:val="both"/>
+        <w:rPr>
+          <w:sz w:val="36"/>
+          <w:szCs w:val="36"/>
+        </w:rPr>
+      </w:pPr>
+      <w:r>
+        <w:rPr>
+          <w:sz w:val="36"/>
+          <w:szCs w:val="36"/>
+        </w:rPr>
         <w:t>Battery Level</w:t>
       </w:r>
     </w:p>
@@ -372,7 +499,7 @@
                     </pic:cNvPicPr>
                   </pic:nvPicPr>
                   <pic:blipFill>
-                    <a:blip r:embed="rId6">
+                    <a:blip r:embed="rId7">
                       <a:extLst>
                         <a:ext uri="{28A0092B-C50C-407E-A947-70E740481C1C}">
                           <a14:useLocalDpi xmlns:a14="http://schemas.microsoft.com/office/drawing/2010/main" val="0"/>
@@ -426,7 +553,7 @@
         <w:pStyle w:val="ListParagraph"/>
         <w:numPr>
           <w:ilvl w:val="0"/>
-          <w:numId w:val="25"/>
+          <w:numId w:val="27"/>
         </w:numPr>
         <w:jc w:val="both"/>
         <w:rPr>
@@ -439,6 +566,7 @@
           <w:sz w:val="36"/>
           <w:szCs w:val="36"/>
         </w:rPr>
+        <w:lastRenderedPageBreak/>
         <w:t>Battery Energy</w:t>
       </w:r>
     </w:p>
@@ -473,7 +601,7 @@
                     </pic:cNvPicPr>
                   </pic:nvPicPr>
                   <pic:blipFill>
-                    <a:blip r:embed="rId7">
+                    <a:blip r:embed="rId8">
                       <a:extLst>
                         <a:ext uri="{28A0092B-C50C-407E-A947-70E740481C1C}">
                           <a14:useLocalDpi xmlns:a14="http://schemas.microsoft.com/office/drawing/2010/main" val="0"/>
@@ -527,7 +655,7 @@
         <w:pStyle w:val="ListParagraph"/>
         <w:numPr>
           <w:ilvl w:val="0"/>
-          <w:numId w:val="25"/>
+          <w:numId w:val="27"/>
         </w:numPr>
         <w:jc w:val="both"/>
         <w:rPr>
@@ -576,7 +704,7 @@
                     </pic:cNvPicPr>
                   </pic:nvPicPr>
                   <pic:blipFill>
-                    <a:blip r:embed="rId8">
+                    <a:blip r:embed="rId9">
                       <a:extLst>
                         <a:ext uri="{28A0092B-C50C-407E-A947-70E740481C1C}">
                           <a14:useLocalDpi xmlns:a14="http://schemas.microsoft.com/office/drawing/2010/main" val="0"/>
@@ -650,7 +778,7 @@
         <w:pStyle w:val="ListParagraph"/>
         <w:numPr>
           <w:ilvl w:val="0"/>
-          <w:numId w:val="25"/>
+          <w:numId w:val="27"/>
         </w:numPr>
         <w:jc w:val="both"/>
         <w:rPr>
@@ -663,7 +791,6 @@
           <w:sz w:val="36"/>
           <w:szCs w:val="36"/>
         </w:rPr>
-        <w:lastRenderedPageBreak/>
         <w:t>Odometer</w:t>
       </w:r>
     </w:p>
@@ -700,7 +827,7 @@
                     </pic:cNvPicPr>
                   </pic:nvPicPr>
                   <pic:blipFill>
-                    <a:blip r:embed="rId9">
+                    <a:blip r:embed="rId10">
                       <a:extLst>
                         <a:ext uri="{28A0092B-C50C-407E-A947-70E740481C1C}">
                           <a14:useLocalDpi xmlns:a14="http://schemas.microsoft.com/office/drawing/2010/main" val="0"/>
@@ -754,7 +881,7 @@
         <w:pStyle w:val="ListParagraph"/>
         <w:numPr>
           <w:ilvl w:val="0"/>
-          <w:numId w:val="25"/>
+          <w:numId w:val="27"/>
         </w:numPr>
         <w:jc w:val="both"/>
         <w:rPr>
@@ -785,6 +912,7 @@
           <w:sz w:val="36"/>
           <w:szCs w:val="36"/>
         </w:rPr>
+        <w:lastRenderedPageBreak/>
         <w:drawing>
           <wp:inline distT="0" distB="0" distL="0" distR="0" wp14:anchorId="6B1C0AEB" wp14:editId="10449362">
             <wp:extent cx="1766455" cy="571500"/>
@@ -803,7 +931,7 @@
                     </pic:cNvPicPr>
                   </pic:nvPicPr>
                   <pic:blipFill>
-                    <a:blip r:embed="rId10">
+                    <a:blip r:embed="rId11">
                       <a:extLst>
                         <a:ext uri="{28A0092B-C50C-407E-A947-70E740481C1C}">
                           <a14:useLocalDpi xmlns:a14="http://schemas.microsoft.com/office/drawing/2010/main" val="0"/>
@@ -1055,7 +1183,6 @@
           <w:sz w:val="36"/>
           <w:szCs w:val="36"/>
         </w:rPr>
-        <w:lastRenderedPageBreak/>
         <w:t>In this instance the icon will change to a “flask” and pulse re</w:t>
       </w:r>
       <w:r>
@@ -1078,7 +1205,7 @@
         <w:pStyle w:val="ListParagraph"/>
         <w:numPr>
           <w:ilvl w:val="0"/>
-          <w:numId w:val="25"/>
+          <w:numId w:val="27"/>
         </w:numPr>
         <w:jc w:val="both"/>
         <w:rPr>
@@ -1127,7 +1254,7 @@
                     </pic:cNvPicPr>
                   </pic:nvPicPr>
                   <pic:blipFill>
-                    <a:blip r:embed="rId11">
+                    <a:blip r:embed="rId12">
                       <a:extLst>
                         <a:ext uri="{28A0092B-C50C-407E-A947-70E740481C1C}">
                           <a14:useLocalDpi xmlns:a14="http://schemas.microsoft.com/office/drawing/2010/main" val="0"/>
@@ -1194,7 +1321,15 @@
           <w:sz w:val="36"/>
           <w:szCs w:val="36"/>
         </w:rPr>
-        <w:t>you connect a plug to the car, the icon will change to yellow and begin to pulse. The state will change to “On Hold”. Once charging commences, the icon will turn orange, continue to pulse and the state will change to “In Progress”. Once charging ends, the state will change to “Charge Ended” and the icon will return to grey.</w:t>
+        <w:t xml:space="preserve">you connect a plug to the car, the icon will change to yellow and begin to pulse. The state </w:t>
+      </w:r>
+      <w:r>
+        <w:rPr>
+          <w:sz w:val="36"/>
+          <w:szCs w:val="36"/>
+        </w:rPr>
+        <w:lastRenderedPageBreak/>
+        <w:t>will change to “On Hold”. Once charging commences, the icon will turn orange, continue to pulse and the state will change to “In Progress”. Once charging ends, the state will change to “Charge Ended” and the icon will return to grey.</w:t>
       </w:r>
       <w:r>
         <w:rPr>
@@ -1375,7 +1510,7 @@
         <w:pStyle w:val="ListParagraph"/>
         <w:numPr>
           <w:ilvl w:val="0"/>
-          <w:numId w:val="25"/>
+          <w:numId w:val="27"/>
         </w:numPr>
         <w:jc w:val="both"/>
         <w:rPr>
@@ -1388,7 +1523,6 @@
           <w:sz w:val="36"/>
           <w:szCs w:val="36"/>
         </w:rPr>
-        <w:lastRenderedPageBreak/>
         <w:t>Charging Rate</w:t>
       </w:r>
     </w:p>
@@ -1425,7 +1559,7 @@
                     </pic:cNvPicPr>
                   </pic:nvPicPr>
                   <pic:blipFill>
-                    <a:blip r:embed="rId12">
+                    <a:blip r:embed="rId13">
                       <a:extLst>
                         <a:ext uri="{28A0092B-C50C-407E-A947-70E740481C1C}">
                           <a14:useLocalDpi xmlns:a14="http://schemas.microsoft.com/office/drawing/2010/main" val="0"/>
@@ -1471,7 +1605,15 @@
           <w:sz w:val="36"/>
           <w:szCs w:val="36"/>
         </w:rPr>
-        <w:t xml:space="preserve">This sensor displays your current charging rate, as exposed by your Home Assistant EV charger integration. If no charge is taking place the icon will be greyed out and the value will read as 0kw. Once charging is detected (&gt;0.2kw) the icon will turn orange and begin to pulse. The state will show the value in kw at the current time, being output by the charger. In the case of </w:t>
+        <w:t xml:space="preserve">This sensor displays your current charging rate, as exposed by your Home Assistant EV charger integration. If no charge is taking place the icon will be greyed out and the value will read as 0kw. Once charging is detected (&gt;0.2kw) the icon will turn orange and begin to pulse. The state will show the value in kw at the current time, being output by the charger. In the </w:t>
+      </w:r>
+      <w:r>
+        <w:rPr>
+          <w:sz w:val="36"/>
+          <w:szCs w:val="36"/>
+        </w:rPr>
+        <w:lastRenderedPageBreak/>
+        <w:t xml:space="preserve">case of </w:t>
       </w:r>
       <w:proofErr w:type="gramStart"/>
       <w:r>
@@ -1553,7 +1695,7 @@
         <w:pStyle w:val="ListParagraph"/>
         <w:numPr>
           <w:ilvl w:val="0"/>
-          <w:numId w:val="25"/>
+          <w:numId w:val="27"/>
         </w:numPr>
         <w:jc w:val="both"/>
         <w:rPr>
@@ -1602,7 +1744,7 @@
                     </pic:cNvPicPr>
                   </pic:nvPicPr>
                   <pic:blipFill>
-                    <a:blip r:embed="rId13">
+                    <a:blip r:embed="rId14">
                       <a:extLst>
                         <a:ext uri="{28A0092B-C50C-407E-A947-70E740481C1C}">
                           <a14:useLocalDpi xmlns:a14="http://schemas.microsoft.com/office/drawing/2010/main" val="0"/>
@@ -1648,15 +1790,7 @@
           <w:sz w:val="36"/>
           <w:szCs w:val="36"/>
         </w:rPr>
-        <w:t xml:space="preserve">This sensor displays the time remaining for the current charger and is derived directly from the API. Renault has a bug whereby the sensor can stick at 3 or 4 mins at the end of the charge. The logic detects this and zeroes the value </w:t>
-      </w:r>
-      <w:r>
-        <w:rPr>
-          <w:sz w:val="36"/>
-          <w:szCs w:val="36"/>
-        </w:rPr>
-        <w:lastRenderedPageBreak/>
-        <w:t>after a set period.  Whe</w:t>
+        <w:t>This sensor displays the time remaining for the current charger and is derived directly from the API. Renault has a bug whereby the sensor can stick at 3 or 4 mins at the end of the charge. The logic detects this and zeroes the value after a set period.  Whe</w:t>
       </w:r>
       <w:r>
         <w:rPr>
@@ -1823,6 +1957,7 @@
           <w:sz w:val="36"/>
           <w:szCs w:val="36"/>
         </w:rPr>
+        <w:lastRenderedPageBreak/>
         <w:t>During a test charge the state will be displayed as:</w:t>
       </w:r>
     </w:p>
@@ -1865,7 +2000,7 @@
         <w:pStyle w:val="ListParagraph"/>
         <w:numPr>
           <w:ilvl w:val="0"/>
-          <w:numId w:val="25"/>
+          <w:numId w:val="27"/>
         </w:numPr>
         <w:jc w:val="both"/>
         <w:rPr>
@@ -1914,7 +2049,7 @@
                     </pic:cNvPicPr>
                   </pic:nvPicPr>
                   <pic:blipFill>
-                    <a:blip r:embed="rId14">
+                    <a:blip r:embed="rId15">
                       <a:extLst>
                         <a:ext uri="{28A0092B-C50C-407E-A947-70E740481C1C}">
                           <a14:useLocalDpi xmlns:a14="http://schemas.microsoft.com/office/drawing/2010/main" val="0"/>
@@ -2060,163 +2195,163 @@
           <w:sz w:val="36"/>
           <w:szCs w:val="36"/>
         </w:rPr>
+        <w:t>“Open: No Plug!” to warn you and the icon will turn red and wiggle.</w:t>
+      </w:r>
+    </w:p>
+    <w:p>
+      <w:pPr>
+        <w:ind w:left="360"/>
+        <w:jc w:val="both"/>
+        <w:rPr>
+          <w:sz w:val="36"/>
+          <w:szCs w:val="36"/>
+        </w:rPr>
+      </w:pPr>
+      <w:r>
+        <w:rPr>
+          <w:sz w:val="36"/>
+          <w:szCs w:val="36"/>
+        </w:rPr>
+        <w:t xml:space="preserve">In </w:t>
+      </w:r>
+      <w:proofErr w:type="gramStart"/>
+      <w:r>
+        <w:rPr>
+          <w:sz w:val="36"/>
+          <w:szCs w:val="36"/>
+        </w:rPr>
+        <w:t>addition</w:t>
+      </w:r>
+      <w:proofErr w:type="gramEnd"/>
+      <w:r>
+        <w:rPr>
+          <w:sz w:val="36"/>
+          <w:szCs w:val="36"/>
+        </w:rPr>
+        <w:t xml:space="preserve"> it is also capable or reporting fault states</w:t>
+      </w:r>
+    </w:p>
+    <w:p>
+      <w:pPr>
+        <w:ind w:left="360"/>
+        <w:jc w:val="both"/>
+        <w:rPr>
+          <w:sz w:val="36"/>
+          <w:szCs w:val="36"/>
+        </w:rPr>
+      </w:pPr>
+      <w:r>
+        <w:rPr>
+          <w:sz w:val="36"/>
+          <w:szCs w:val="36"/>
+        </w:rPr>
+        <w:t>Undetermined (A)</w:t>
+      </w:r>
+      <w:r>
+        <w:rPr>
+          <w:sz w:val="36"/>
+          <w:szCs w:val="36"/>
+        </w:rPr>
+        <w:t>: Authorisation issue with the server</w:t>
+      </w:r>
+    </w:p>
+    <w:p>
+      <w:pPr>
+        <w:ind w:left="360"/>
+        <w:jc w:val="both"/>
+        <w:rPr>
+          <w:sz w:val="36"/>
+          <w:szCs w:val="36"/>
+        </w:rPr>
+      </w:pPr>
+      <w:r>
+        <w:rPr>
+          <w:sz w:val="36"/>
+          <w:szCs w:val="36"/>
+        </w:rPr>
+        <w:t>Undetermined (S)</w:t>
+      </w:r>
+      <w:r>
+        <w:rPr>
+          <w:sz w:val="36"/>
+          <w:szCs w:val="36"/>
+        </w:rPr>
+        <w:t>: Stale data</w:t>
+      </w:r>
+    </w:p>
+    <w:p>
+      <w:pPr>
+        <w:ind w:left="360"/>
+        <w:jc w:val="both"/>
+        <w:rPr>
+          <w:sz w:val="36"/>
+          <w:szCs w:val="36"/>
+        </w:rPr>
+      </w:pPr>
+      <w:r>
+        <w:rPr>
+          <w:sz w:val="36"/>
+          <w:szCs w:val="36"/>
+        </w:rPr>
+        <w:t>Unknown (CLI)</w:t>
+      </w:r>
+      <w:r>
+        <w:rPr>
+          <w:sz w:val="36"/>
+          <w:szCs w:val="36"/>
+        </w:rPr>
+        <w:t>: Command prompt detected during login</w:t>
+      </w:r>
+    </w:p>
+    <w:p>
+      <w:pPr>
+        <w:ind w:left="360"/>
+        <w:jc w:val="both"/>
+        <w:rPr>
+          <w:sz w:val="36"/>
+          <w:szCs w:val="36"/>
+        </w:rPr>
+      </w:pPr>
+      <w:r>
+        <w:rPr>
+          <w:sz w:val="36"/>
+          <w:szCs w:val="36"/>
+        </w:rPr>
+        <w:t>In these fault states the icon will change to a “Help” symbol</w:t>
+      </w:r>
+    </w:p>
+    <w:p>
+      <w:pPr>
+        <w:ind w:left="360"/>
+        <w:jc w:val="both"/>
+        <w:rPr>
+          <w:sz w:val="36"/>
+          <w:szCs w:val="36"/>
+        </w:rPr>
+      </w:pPr>
+      <w:r>
+        <w:rPr>
+          <w:sz w:val="36"/>
+          <w:szCs w:val="36"/>
+        </w:rPr>
+        <w:t>During a test charge the state will be displayed as:</w:t>
+      </w:r>
+    </w:p>
+    <w:p>
+      <w:pPr>
+        <w:ind w:left="360"/>
+        <w:jc w:val="both"/>
+        <w:rPr>
+          <w:sz w:val="36"/>
+          <w:szCs w:val="36"/>
+        </w:rPr>
+      </w:pPr>
+      <w:r>
+        <w:rPr>
+          <w:sz w:val="36"/>
+          <w:szCs w:val="36"/>
+        </w:rPr>
         <w:lastRenderedPageBreak/>
-        <w:t>“Open: No Plug!” to warn you and the icon will turn red and wiggle.</w:t>
-      </w:r>
-    </w:p>
-    <w:p>
-      <w:pPr>
-        <w:ind w:left="360"/>
-        <w:jc w:val="both"/>
-        <w:rPr>
-          <w:sz w:val="36"/>
-          <w:szCs w:val="36"/>
-        </w:rPr>
-      </w:pPr>
-      <w:r>
-        <w:rPr>
-          <w:sz w:val="36"/>
-          <w:szCs w:val="36"/>
-        </w:rPr>
-        <w:t xml:space="preserve">In </w:t>
-      </w:r>
-      <w:proofErr w:type="gramStart"/>
-      <w:r>
-        <w:rPr>
-          <w:sz w:val="36"/>
-          <w:szCs w:val="36"/>
-        </w:rPr>
-        <w:t>addition</w:t>
-      </w:r>
-      <w:proofErr w:type="gramEnd"/>
-      <w:r>
-        <w:rPr>
-          <w:sz w:val="36"/>
-          <w:szCs w:val="36"/>
-        </w:rPr>
-        <w:t xml:space="preserve"> it is also capable or reporting fault states</w:t>
-      </w:r>
-    </w:p>
-    <w:p>
-      <w:pPr>
-        <w:ind w:left="360"/>
-        <w:jc w:val="both"/>
-        <w:rPr>
-          <w:sz w:val="36"/>
-          <w:szCs w:val="36"/>
-        </w:rPr>
-      </w:pPr>
-      <w:r>
-        <w:rPr>
-          <w:sz w:val="36"/>
-          <w:szCs w:val="36"/>
-        </w:rPr>
-        <w:t>Undetermined (A)</w:t>
-      </w:r>
-      <w:r>
-        <w:rPr>
-          <w:sz w:val="36"/>
-          <w:szCs w:val="36"/>
-        </w:rPr>
-        <w:t>: Authorisation issue with the server</w:t>
-      </w:r>
-    </w:p>
-    <w:p>
-      <w:pPr>
-        <w:ind w:left="360"/>
-        <w:jc w:val="both"/>
-        <w:rPr>
-          <w:sz w:val="36"/>
-          <w:szCs w:val="36"/>
-        </w:rPr>
-      </w:pPr>
-      <w:r>
-        <w:rPr>
-          <w:sz w:val="36"/>
-          <w:szCs w:val="36"/>
-        </w:rPr>
-        <w:t>Undetermined (S)</w:t>
-      </w:r>
-      <w:r>
-        <w:rPr>
-          <w:sz w:val="36"/>
-          <w:szCs w:val="36"/>
-        </w:rPr>
-        <w:t>: Stale data</w:t>
-      </w:r>
-    </w:p>
-    <w:p>
-      <w:pPr>
-        <w:ind w:left="360"/>
-        <w:jc w:val="both"/>
-        <w:rPr>
-          <w:sz w:val="36"/>
-          <w:szCs w:val="36"/>
-        </w:rPr>
-      </w:pPr>
-      <w:r>
-        <w:rPr>
-          <w:sz w:val="36"/>
-          <w:szCs w:val="36"/>
-        </w:rPr>
-        <w:t>Unknown (CLI)</w:t>
-      </w:r>
-      <w:r>
-        <w:rPr>
-          <w:sz w:val="36"/>
-          <w:szCs w:val="36"/>
-        </w:rPr>
-        <w:t>: Command prompt detected during login</w:t>
-      </w:r>
-    </w:p>
-    <w:p>
-      <w:pPr>
-        <w:ind w:left="360"/>
-        <w:jc w:val="both"/>
-        <w:rPr>
-          <w:sz w:val="36"/>
-          <w:szCs w:val="36"/>
-        </w:rPr>
-      </w:pPr>
-      <w:r>
-        <w:rPr>
-          <w:sz w:val="36"/>
-          <w:szCs w:val="36"/>
-        </w:rPr>
-        <w:t>In these fault states the icon will change to a “Help” symbol</w:t>
-      </w:r>
-    </w:p>
-    <w:p>
-      <w:pPr>
-        <w:ind w:left="360"/>
-        <w:jc w:val="both"/>
-        <w:rPr>
-          <w:sz w:val="36"/>
-          <w:szCs w:val="36"/>
-        </w:rPr>
-      </w:pPr>
-      <w:r>
-        <w:rPr>
-          <w:sz w:val="36"/>
-          <w:szCs w:val="36"/>
-        </w:rPr>
-        <w:t>During a test charge the state will be displayed as:</w:t>
-      </w:r>
-    </w:p>
-    <w:p>
-      <w:pPr>
-        <w:ind w:left="360"/>
-        <w:jc w:val="both"/>
-        <w:rPr>
-          <w:sz w:val="36"/>
-          <w:szCs w:val="36"/>
-        </w:rPr>
-      </w:pPr>
-      <w:r>
-        <w:rPr>
-          <w:sz w:val="36"/>
-          <w:szCs w:val="36"/>
-        </w:rPr>
         <w:t xml:space="preserve">“(Test) Open” </w:t>
       </w:r>
     </w:p>
@@ -2287,7 +2422,7 @@
                     </pic:cNvPicPr>
                   </pic:nvPicPr>
                   <pic:blipFill>
-                    <a:blip r:embed="rId15">
+                    <a:blip r:embed="rId16">
                       <a:extLst>
                         <a:ext uri="{28A0092B-C50C-407E-A947-70E740481C1C}">
                           <a14:useLocalDpi xmlns:a14="http://schemas.microsoft.com/office/drawing/2010/main" val="0"/>
@@ -2415,214 +2550,214 @@
           <w:sz w:val="36"/>
           <w:szCs w:val="36"/>
         </w:rPr>
+        <w:t xml:space="preserve">If </w:t>
+      </w:r>
+      <w:r>
+        <w:rPr>
+          <w:sz w:val="36"/>
+          <w:szCs w:val="36"/>
+        </w:rPr>
+        <w:t>&gt;=</w:t>
+      </w:r>
+      <w:r>
+        <w:rPr>
+          <w:sz w:val="36"/>
+          <w:szCs w:val="36"/>
+        </w:rPr>
+        <w:t xml:space="preserve"> 20C</w:t>
+      </w:r>
+    </w:p>
+    <w:p>
+      <w:pPr>
+        <w:ind w:left="360"/>
+        <w:jc w:val="both"/>
+        <w:rPr>
+          <w:sz w:val="36"/>
+          <w:szCs w:val="36"/>
+        </w:rPr>
+      </w:pPr>
+      <w:r>
+        <w:rPr>
+          <w:sz w:val="36"/>
+          <w:szCs w:val="36"/>
+        </w:rPr>
+        <w:t>icon: sun-the</w:t>
+      </w:r>
+      <w:r>
+        <w:rPr>
+          <w:sz w:val="36"/>
+          <w:szCs w:val="36"/>
+        </w:rPr>
+        <w:t>r</w:t>
+      </w:r>
+      <w:r>
+        <w:rPr>
+          <w:sz w:val="36"/>
+          <w:szCs w:val="36"/>
+        </w:rPr>
+        <w:t>mometer</w:t>
+      </w:r>
+    </w:p>
+    <w:p>
+      <w:pPr>
+        <w:ind w:left="360"/>
+        <w:jc w:val="both"/>
+        <w:rPr>
+          <w:sz w:val="36"/>
+          <w:szCs w:val="36"/>
+        </w:rPr>
+      </w:pPr>
+      <w:r>
+        <w:rPr>
+          <w:sz w:val="36"/>
+          <w:szCs w:val="36"/>
+        </w:rPr>
+        <w:t>i</w:t>
+      </w:r>
+      <w:r>
+        <w:rPr>
+          <w:sz w:val="36"/>
+          <w:szCs w:val="36"/>
+        </w:rPr>
+        <w:t xml:space="preserve">f </w:t>
+      </w:r>
+      <w:r>
+        <w:rPr>
+          <w:sz w:val="36"/>
+          <w:szCs w:val="36"/>
+        </w:rPr>
+        <w:t>&lt;20</w:t>
+      </w:r>
+      <w:proofErr w:type="gramStart"/>
+      <w:r>
+        <w:rPr>
+          <w:sz w:val="36"/>
+          <w:szCs w:val="36"/>
+        </w:rPr>
+        <w:t>C</w:t>
+      </w:r>
+      <w:r>
+        <w:rPr>
+          <w:sz w:val="36"/>
+          <w:szCs w:val="36"/>
+        </w:rPr>
+        <w:t xml:space="preserve"> :</w:t>
+      </w:r>
+      <w:proofErr w:type="gramEnd"/>
+      <w:r>
+        <w:rPr>
+          <w:sz w:val="36"/>
+          <w:szCs w:val="36"/>
+        </w:rPr>
+        <w:t xml:space="preserve"> </w:t>
+      </w:r>
+    </w:p>
+    <w:p>
+      <w:pPr>
+        <w:ind w:left="360"/>
+        <w:jc w:val="both"/>
+        <w:rPr>
+          <w:sz w:val="36"/>
+          <w:szCs w:val="36"/>
+        </w:rPr>
+      </w:pPr>
+      <w:r>
+        <w:rPr>
+          <w:sz w:val="36"/>
+          <w:szCs w:val="36"/>
+        </w:rPr>
+        <w:t>icon: thermometer</w:t>
+      </w:r>
+    </w:p>
+    <w:p>
+      <w:pPr>
+        <w:ind w:left="360"/>
+        <w:jc w:val="both"/>
+        <w:rPr>
+          <w:sz w:val="36"/>
+          <w:szCs w:val="36"/>
+        </w:rPr>
+      </w:pPr>
+      <w:r>
+        <w:rPr>
+          <w:sz w:val="36"/>
+          <w:szCs w:val="36"/>
+        </w:rPr>
+        <w:t>if</w:t>
+      </w:r>
+      <w:r>
+        <w:rPr>
+          <w:sz w:val="36"/>
+          <w:szCs w:val="36"/>
+        </w:rPr>
+        <w:t xml:space="preserve"> </w:t>
+      </w:r>
+      <w:r>
+        <w:rPr>
+          <w:sz w:val="36"/>
+          <w:szCs w:val="36"/>
+        </w:rPr>
+        <w:t>&lt;=</w:t>
+      </w:r>
+      <w:r>
+        <w:rPr>
+          <w:sz w:val="36"/>
+          <w:szCs w:val="36"/>
+        </w:rPr>
+        <w:t>10C</w:t>
+      </w:r>
+    </w:p>
+    <w:p>
+      <w:pPr>
+        <w:ind w:left="360"/>
+        <w:jc w:val="both"/>
+        <w:rPr>
+          <w:sz w:val="36"/>
+          <w:szCs w:val="36"/>
+        </w:rPr>
+      </w:pPr>
+      <w:r>
+        <w:rPr>
+          <w:sz w:val="36"/>
+          <w:szCs w:val="36"/>
+        </w:rPr>
+        <w:t>icon: snowflake-</w:t>
+      </w:r>
+      <w:proofErr w:type="spellStart"/>
+      <w:r>
+        <w:rPr>
+          <w:sz w:val="36"/>
+          <w:szCs w:val="36"/>
+        </w:rPr>
+        <w:t>themometer</w:t>
+      </w:r>
+      <w:proofErr w:type="spellEnd"/>
+    </w:p>
+    <w:p>
+      <w:pPr>
+        <w:ind w:left="360"/>
+        <w:jc w:val="both"/>
+        <w:rPr>
+          <w:sz w:val="36"/>
+          <w:szCs w:val="36"/>
+        </w:rPr>
+      </w:pPr>
+    </w:p>
+    <w:p>
+      <w:pPr>
+        <w:ind w:left="360"/>
+        <w:jc w:val="both"/>
+        <w:rPr>
+          <w:sz w:val="36"/>
+          <w:szCs w:val="36"/>
+        </w:rPr>
+      </w:pPr>
+      <w:r>
+        <w:rPr>
+          <w:sz w:val="36"/>
+          <w:szCs w:val="36"/>
+        </w:rPr>
         <w:lastRenderedPageBreak/>
-        <w:t xml:space="preserve">If </w:t>
-      </w:r>
-      <w:r>
-        <w:rPr>
-          <w:sz w:val="36"/>
-          <w:szCs w:val="36"/>
-        </w:rPr>
-        <w:t>&gt;=</w:t>
-      </w:r>
-      <w:r>
-        <w:rPr>
-          <w:sz w:val="36"/>
-          <w:szCs w:val="36"/>
-        </w:rPr>
-        <w:t xml:space="preserve"> 20C</w:t>
-      </w:r>
-    </w:p>
-    <w:p>
-      <w:pPr>
-        <w:ind w:left="360"/>
-        <w:jc w:val="both"/>
-        <w:rPr>
-          <w:sz w:val="36"/>
-          <w:szCs w:val="36"/>
-        </w:rPr>
-      </w:pPr>
-      <w:r>
-        <w:rPr>
-          <w:sz w:val="36"/>
-          <w:szCs w:val="36"/>
-        </w:rPr>
-        <w:t>icon: sun-the</w:t>
-      </w:r>
-      <w:r>
-        <w:rPr>
-          <w:sz w:val="36"/>
-          <w:szCs w:val="36"/>
-        </w:rPr>
-        <w:t>r</w:t>
-      </w:r>
-      <w:r>
-        <w:rPr>
-          <w:sz w:val="36"/>
-          <w:szCs w:val="36"/>
-        </w:rPr>
-        <w:t>mometer</w:t>
-      </w:r>
-    </w:p>
-    <w:p>
-      <w:pPr>
-        <w:ind w:left="360"/>
-        <w:jc w:val="both"/>
-        <w:rPr>
-          <w:sz w:val="36"/>
-          <w:szCs w:val="36"/>
-        </w:rPr>
-      </w:pPr>
-      <w:r>
-        <w:rPr>
-          <w:sz w:val="36"/>
-          <w:szCs w:val="36"/>
-        </w:rPr>
-        <w:t>i</w:t>
-      </w:r>
-      <w:r>
-        <w:rPr>
-          <w:sz w:val="36"/>
-          <w:szCs w:val="36"/>
-        </w:rPr>
-        <w:t xml:space="preserve">f </w:t>
-      </w:r>
-      <w:r>
-        <w:rPr>
-          <w:sz w:val="36"/>
-          <w:szCs w:val="36"/>
-        </w:rPr>
-        <w:t>&lt;20</w:t>
-      </w:r>
-      <w:proofErr w:type="gramStart"/>
-      <w:r>
-        <w:rPr>
-          <w:sz w:val="36"/>
-          <w:szCs w:val="36"/>
-        </w:rPr>
-        <w:t>C</w:t>
-      </w:r>
-      <w:r>
-        <w:rPr>
-          <w:sz w:val="36"/>
-          <w:szCs w:val="36"/>
-        </w:rPr>
-        <w:t xml:space="preserve"> :</w:t>
-      </w:r>
-      <w:proofErr w:type="gramEnd"/>
-      <w:r>
-        <w:rPr>
-          <w:sz w:val="36"/>
-          <w:szCs w:val="36"/>
-        </w:rPr>
-        <w:t xml:space="preserve"> </w:t>
-      </w:r>
-    </w:p>
-    <w:p>
-      <w:pPr>
-        <w:ind w:left="360"/>
-        <w:jc w:val="both"/>
-        <w:rPr>
-          <w:sz w:val="36"/>
-          <w:szCs w:val="36"/>
-        </w:rPr>
-      </w:pPr>
-      <w:r>
-        <w:rPr>
-          <w:sz w:val="36"/>
-          <w:szCs w:val="36"/>
-        </w:rPr>
-        <w:t>icon: thermometer</w:t>
-      </w:r>
-    </w:p>
-    <w:p>
-      <w:pPr>
-        <w:ind w:left="360"/>
-        <w:jc w:val="both"/>
-        <w:rPr>
-          <w:sz w:val="36"/>
-          <w:szCs w:val="36"/>
-        </w:rPr>
-      </w:pPr>
-      <w:r>
-        <w:rPr>
-          <w:sz w:val="36"/>
-          <w:szCs w:val="36"/>
-        </w:rPr>
-        <w:t>if</w:t>
-      </w:r>
-      <w:r>
-        <w:rPr>
-          <w:sz w:val="36"/>
-          <w:szCs w:val="36"/>
-        </w:rPr>
-        <w:t xml:space="preserve"> </w:t>
-      </w:r>
-      <w:r>
-        <w:rPr>
-          <w:sz w:val="36"/>
-          <w:szCs w:val="36"/>
-        </w:rPr>
-        <w:t>&lt;=</w:t>
-      </w:r>
-      <w:r>
-        <w:rPr>
-          <w:sz w:val="36"/>
-          <w:szCs w:val="36"/>
-        </w:rPr>
-        <w:t>10C</w:t>
-      </w:r>
-    </w:p>
-    <w:p>
-      <w:pPr>
-        <w:ind w:left="360"/>
-        <w:jc w:val="both"/>
-        <w:rPr>
-          <w:sz w:val="36"/>
-          <w:szCs w:val="36"/>
-        </w:rPr>
-      </w:pPr>
-      <w:r>
-        <w:rPr>
-          <w:sz w:val="36"/>
-          <w:szCs w:val="36"/>
-        </w:rPr>
-        <w:t>icon: snowflake-</w:t>
-      </w:r>
-      <w:proofErr w:type="spellStart"/>
-      <w:r>
-        <w:rPr>
-          <w:sz w:val="36"/>
-          <w:szCs w:val="36"/>
-        </w:rPr>
-        <w:t>themometer</w:t>
-      </w:r>
-      <w:proofErr w:type="spellEnd"/>
-    </w:p>
-    <w:p>
-      <w:pPr>
-        <w:ind w:left="360"/>
-        <w:jc w:val="both"/>
-        <w:rPr>
-          <w:sz w:val="36"/>
-          <w:szCs w:val="36"/>
-        </w:rPr>
-      </w:pPr>
-    </w:p>
-    <w:p>
-      <w:pPr>
-        <w:ind w:left="360"/>
-        <w:jc w:val="both"/>
-        <w:rPr>
-          <w:sz w:val="36"/>
-          <w:szCs w:val="36"/>
-        </w:rPr>
-      </w:pPr>
-      <w:r>
-        <w:rPr>
-          <w:sz w:val="36"/>
-          <w:szCs w:val="36"/>
-        </w:rPr>
         <w:t>The colour logic is as follows:</w:t>
       </w:r>
     </w:p>
@@ -2873,7 +3008,7 @@
                     </pic:cNvPicPr>
                   </pic:nvPicPr>
                   <pic:blipFill>
-                    <a:blip r:embed="rId16">
+                    <a:blip r:embed="rId17">
                       <a:extLst>
                         <a:ext uri="{28A0092B-C50C-407E-A947-70E740481C1C}">
                           <a14:useLocalDpi xmlns:a14="http://schemas.microsoft.com/office/drawing/2010/main" val="0"/>
@@ -2972,15 +3107,7 @@
           <w:sz w:val="36"/>
           <w:szCs w:val="36"/>
         </w:rPr>
-        <w:t xml:space="preserve">, you will </w:t>
-      </w:r>
-      <w:r>
-        <w:rPr>
-          <w:sz w:val="36"/>
-          <w:szCs w:val="36"/>
-        </w:rPr>
-        <w:lastRenderedPageBreak/>
-        <w:t xml:space="preserve">see it change. </w:t>
+        <w:t xml:space="preserve">, you will see it change. </w:t>
       </w:r>
       <w:proofErr w:type="gramStart"/>
       <w:r>
@@ -3059,7 +3186,7 @@
                     </pic:cNvPicPr>
                   </pic:nvPicPr>
                   <pic:blipFill>
-                    <a:blip r:embed="rId17">
+                    <a:blip r:embed="rId18">
                       <a:extLst>
                         <a:ext uri="{28A0092B-C50C-407E-A947-70E740481C1C}">
                           <a14:useLocalDpi xmlns:a14="http://schemas.microsoft.com/office/drawing/2010/main" val="0"/>
@@ -3105,7 +3232,15 @@
           <w:sz w:val="36"/>
           <w:szCs w:val="36"/>
         </w:rPr>
-        <w:t>This sensor displays the HVAC threshold of your car. The value is derived directly from the API, and is the battery’s SoC value, below which you CANNOT start HVAC. To warn you, if the battery’s SOC drops below 15%, the icon turns red.</w:t>
+        <w:t xml:space="preserve">This sensor displays the HVAC threshold of your car. The value is derived directly from the API, and is the battery’s </w:t>
+      </w:r>
+      <w:r>
+        <w:rPr>
+          <w:sz w:val="36"/>
+          <w:szCs w:val="36"/>
+        </w:rPr>
+        <w:lastRenderedPageBreak/>
+        <w:t>SoC value, below which you CANNOT start HVAC. To warn you, if the battery’s SOC drops below 15%, the icon turns red.</w:t>
       </w:r>
     </w:p>
     <w:p>
@@ -3195,7 +3330,7 @@
                     </pic:cNvPicPr>
                   </pic:nvPicPr>
                   <pic:blipFill>
-                    <a:blip r:embed="rId18">
+                    <a:blip r:embed="rId19">
                       <a:extLst>
                         <a:ext uri="{28A0092B-C50C-407E-A947-70E740481C1C}">
                           <a14:useLocalDpi xmlns:a14="http://schemas.microsoft.com/office/drawing/2010/main" val="0"/>
@@ -3374,6 +3509,7 @@
           <w:szCs w:val="36"/>
           <w:u w:val="single"/>
         </w:rPr>
+        <w:lastRenderedPageBreak/>
         <w:drawing>
           <wp:inline distT="0" distB="0" distL="0" distR="0" wp14:anchorId="6D1CFC48" wp14:editId="1692A671">
             <wp:extent cx="5476875" cy="2940604"/>
@@ -3392,7 +3528,7 @@
                     </pic:cNvPicPr>
                   </pic:nvPicPr>
                   <pic:blipFill>
-                    <a:blip r:embed="rId19">
+                    <a:blip r:embed="rId20">
                       <a:extLst>
                         <a:ext uri="{28A0092B-C50C-407E-A947-70E740481C1C}">
                           <a14:useLocalDpi xmlns:a14="http://schemas.microsoft.com/office/drawing/2010/main" val="0"/>
@@ -3536,7 +3672,6 @@
           <w:sz w:val="36"/>
           <w:szCs w:val="36"/>
         </w:rPr>
-        <w:lastRenderedPageBreak/>
         <w:t>Passenger/Driver’s seat – as for steering wheel</w:t>
       </w:r>
     </w:p>
@@ -3668,6 +3803,7 @@
           <w:sz w:val="36"/>
           <w:szCs w:val="36"/>
         </w:rPr>
+        <w:lastRenderedPageBreak/>
         <w:drawing>
           <wp:inline distT="0" distB="0" distL="0" distR="0" wp14:anchorId="7DB48330" wp14:editId="2587DFBF">
             <wp:extent cx="4886325" cy="2013958"/>
@@ -3686,7 +3822,7 @@
                     </pic:cNvPicPr>
                   </pic:nvPicPr>
                   <pic:blipFill>
-                    <a:blip r:embed="rId20">
+                    <a:blip r:embed="rId21">
                       <a:extLst>
                         <a:ext uri="{28A0092B-C50C-407E-A947-70E740481C1C}">
                           <a14:useLocalDpi xmlns:a14="http://schemas.microsoft.com/office/drawing/2010/main" val="0"/>
@@ -3829,92 +3965,85 @@
           <w:sz w:val="36"/>
           <w:szCs w:val="36"/>
         </w:rPr>
-        <w:t xml:space="preserve"> can often lag, depending on the state of the car (sleep mode) but will usually wake the car up and run HVAC within a couple of minutes. You will see this reflected by the </w:t>
-      </w:r>
+        <w:t xml:space="preserve"> can often lag, depending on the state of the car (sleep mode) but will usually wake the car up and run HVAC within a couple of minutes. You will see this reflected by the spinning yellow icon next to the HVAC Status sensor discussed earlier.</w:t>
+      </w:r>
+    </w:p>
+    <w:p>
+      <w:pPr>
+        <w:ind w:left="360"/>
+        <w:jc w:val="both"/>
+        <w:rPr>
+          <w:sz w:val="36"/>
+          <w:szCs w:val="36"/>
+        </w:rPr>
+      </w:pPr>
+      <w:r>
+        <w:rPr>
+          <w:sz w:val="36"/>
+          <w:szCs w:val="36"/>
+        </w:rPr>
+        <w:t xml:space="preserve">HVAC Stop: Can and often does NOT work well, due wholly to the API and is a limitation that is a Renault </w:t>
+      </w:r>
+      <w:proofErr w:type="gramStart"/>
+      <w:r>
+        <w:rPr>
+          <w:sz w:val="36"/>
+          <w:szCs w:val="36"/>
+        </w:rPr>
+        <w:t>server side</w:t>
+      </w:r>
+      <w:proofErr w:type="gramEnd"/>
+      <w:r>
+        <w:rPr>
+          <w:sz w:val="36"/>
+          <w:szCs w:val="36"/>
+        </w:rPr>
+        <w:t xml:space="preserve"> problem. However</w:t>
+      </w:r>
+      <w:r>
+        <w:rPr>
+          <w:sz w:val="36"/>
+          <w:szCs w:val="36"/>
+        </w:rPr>
+        <w:t>,</w:t>
+      </w:r>
+      <w:r>
+        <w:rPr>
+          <w:sz w:val="36"/>
+          <w:szCs w:val="36"/>
+        </w:rPr>
+        <w:t xml:space="preserve"> if the API is playing ball</w:t>
+      </w:r>
+      <w:r>
+        <w:rPr>
+          <w:sz w:val="36"/>
+          <w:szCs w:val="36"/>
+        </w:rPr>
+        <w:t>,</w:t>
+      </w:r>
+      <w:r>
+        <w:rPr>
+          <w:sz w:val="36"/>
+          <w:szCs w:val="36"/>
+        </w:rPr>
+        <w:t xml:space="preserve"> then it does stop the HVAC running within a minute or so. Note that in any case HVAC will timeout after 15 mins of run time by design.</w:t>
+      </w:r>
+    </w:p>
+    <w:p>
+      <w:pPr>
+        <w:ind w:left="360"/>
+        <w:jc w:val="both"/>
+        <w:rPr>
+          <w:sz w:val="36"/>
+          <w:szCs w:val="36"/>
+        </w:rPr>
+      </w:pPr>
       <w:r>
         <w:rPr>
           <w:sz w:val="36"/>
           <w:szCs w:val="36"/>
         </w:rPr>
         <w:lastRenderedPageBreak/>
-        <w:t>spinning yellow icon next to the HVAC Status sensor discussed earlier.</w:t>
-      </w:r>
-    </w:p>
-    <w:p>
-      <w:pPr>
-        <w:ind w:left="360"/>
-        <w:jc w:val="both"/>
-        <w:rPr>
-          <w:sz w:val="36"/>
-          <w:szCs w:val="36"/>
-        </w:rPr>
-      </w:pPr>
-      <w:r>
-        <w:rPr>
-          <w:sz w:val="36"/>
-          <w:szCs w:val="36"/>
-        </w:rPr>
-        <w:t xml:space="preserve">HVAC Stop: Can and often does NOT work well, due wholly to the API and is a limitation that is a Renault </w:t>
-      </w:r>
-      <w:proofErr w:type="gramStart"/>
-      <w:r>
-        <w:rPr>
-          <w:sz w:val="36"/>
-          <w:szCs w:val="36"/>
-        </w:rPr>
-        <w:t>server side</w:t>
-      </w:r>
-      <w:proofErr w:type="gramEnd"/>
-      <w:r>
-        <w:rPr>
-          <w:sz w:val="36"/>
-          <w:szCs w:val="36"/>
-        </w:rPr>
-        <w:t xml:space="preserve"> problem. However</w:t>
-      </w:r>
-      <w:r>
-        <w:rPr>
-          <w:sz w:val="36"/>
-          <w:szCs w:val="36"/>
-        </w:rPr>
-        <w:t>,</w:t>
-      </w:r>
-      <w:r>
-        <w:rPr>
-          <w:sz w:val="36"/>
-          <w:szCs w:val="36"/>
-        </w:rPr>
-        <w:t xml:space="preserve"> if the API is playing ball</w:t>
-      </w:r>
-      <w:r>
-        <w:rPr>
-          <w:sz w:val="36"/>
-          <w:szCs w:val="36"/>
-        </w:rPr>
-        <w:t>,</w:t>
-      </w:r>
-      <w:r>
-        <w:rPr>
-          <w:sz w:val="36"/>
-          <w:szCs w:val="36"/>
-        </w:rPr>
-        <w:t xml:space="preserve"> then it does stop the HVAC running within a minute or so. Note that in any case HVAC will timeout after 15 mins of run time by design.</w:t>
-      </w:r>
-    </w:p>
-    <w:p>
-      <w:pPr>
-        <w:ind w:left="360"/>
-        <w:jc w:val="both"/>
-        <w:rPr>
-          <w:sz w:val="36"/>
-          <w:szCs w:val="36"/>
-        </w:rPr>
-      </w:pPr>
-      <w:r>
-        <w:rPr>
-          <w:sz w:val="36"/>
-          <w:szCs w:val="36"/>
-        </w:rPr>
         <w:t xml:space="preserve">Beep Horn: when pressed will </w:t>
       </w:r>
       <w:proofErr w:type="spellStart"/>
@@ -4019,7 +4148,7 @@
                     </pic:cNvPicPr>
                   </pic:nvPicPr>
                   <pic:blipFill>
-                    <a:blip r:embed="rId21">
+                    <a:blip r:embed="rId22">
                       <a:extLst>
                         <a:ext uri="{28A0092B-C50C-407E-A947-70E740481C1C}">
                           <a14:useLocalDpi xmlns:a14="http://schemas.microsoft.com/office/drawing/2010/main" val="0"/>
@@ -4065,15 +4194,210 @@
           <w:sz w:val="36"/>
           <w:szCs w:val="36"/>
         </w:rPr>
+        <w:t>This section is made up of 15 sensors</w:t>
+      </w:r>
+      <w:r>
+        <w:rPr>
+          <w:sz w:val="36"/>
+          <w:szCs w:val="36"/>
+        </w:rPr>
+        <w:t xml:space="preserve">, most of which are </w:t>
+      </w:r>
+      <w:proofErr w:type="spellStart"/>
+      <w:r>
+        <w:rPr>
+          <w:sz w:val="36"/>
+          <w:szCs w:val="36"/>
+        </w:rPr>
+        <w:t>self explanatory</w:t>
+      </w:r>
+      <w:proofErr w:type="spellEnd"/>
+      <w:r>
+        <w:rPr>
+          <w:sz w:val="36"/>
+          <w:szCs w:val="36"/>
+        </w:rPr>
+        <w:t xml:space="preserve"> such as start/end soc, total etc.</w:t>
+      </w:r>
+    </w:p>
+    <w:p>
+      <w:pPr>
+        <w:ind w:left="360"/>
+        <w:jc w:val="both"/>
+        <w:rPr>
+          <w:sz w:val="36"/>
+          <w:szCs w:val="36"/>
+        </w:rPr>
+      </w:pPr>
+      <w:r>
+        <w:rPr>
+          <w:sz w:val="36"/>
+          <w:szCs w:val="36"/>
+        </w:rPr>
+        <w:t xml:space="preserve">When the start of a charge is detected, the Start SOC (78% as shown in the example above) will reflect the value </w:t>
+      </w:r>
+      <w:r>
+        <w:rPr>
+          <w:sz w:val="36"/>
+          <w:szCs w:val="36"/>
+        </w:rPr>
+        <w:t>captured</w:t>
+      </w:r>
+      <w:r>
+        <w:rPr>
+          <w:sz w:val="36"/>
+          <w:szCs w:val="36"/>
+        </w:rPr>
+        <w:t xml:space="preserve"> at that moment, similarly the same applies to</w:t>
+      </w:r>
+      <w:r>
+        <w:rPr>
+          <w:sz w:val="36"/>
+          <w:szCs w:val="36"/>
+        </w:rPr>
+        <w:t xml:space="preserve"> the </w:t>
+      </w:r>
+      <w:r>
+        <w:rPr>
+          <w:sz w:val="36"/>
+          <w:szCs w:val="36"/>
+        </w:rPr>
+        <w:t>start energy</w:t>
+      </w:r>
+      <w:r>
+        <w:rPr>
+          <w:sz w:val="36"/>
+          <w:szCs w:val="36"/>
+        </w:rPr>
+        <w:t xml:space="preserve"> value</w:t>
+      </w:r>
+      <w:r>
+        <w:rPr>
+          <w:sz w:val="36"/>
+          <w:szCs w:val="36"/>
+        </w:rPr>
+        <w:t xml:space="preserve"> (40.6 kWh as shown in the example above and the Initial power from the charger</w:t>
+      </w:r>
+      <w:r>
+        <w:rPr>
+          <w:sz w:val="36"/>
+          <w:szCs w:val="36"/>
+        </w:rPr>
+        <w:t xml:space="preserve"> 6.0 kw). ALL the </w:t>
+      </w:r>
+      <w:r>
+        <w:rPr>
+          <w:sz w:val="36"/>
+          <w:szCs w:val="36"/>
+        </w:rPr>
         <w:lastRenderedPageBreak/>
-        <w:t>This section is made up of 15 sensors</w:t>
-      </w:r>
-      <w:r>
-        <w:rPr>
-          <w:sz w:val="36"/>
-          <w:szCs w:val="36"/>
-        </w:rPr>
-        <w:t xml:space="preserve">, most of which are </w:t>
+        <w:t>remaining sensor’s icons will turn grey and their states will show “Wait…”</w:t>
+      </w:r>
+      <w:r>
+        <w:rPr>
+          <w:sz w:val="36"/>
+          <w:szCs w:val="36"/>
+        </w:rPr>
+        <w:t xml:space="preserve"> for the duration of the charge</w:t>
+      </w:r>
+      <w:r>
+        <w:rPr>
+          <w:sz w:val="36"/>
+          <w:szCs w:val="36"/>
+        </w:rPr>
+        <w:t xml:space="preserve">. </w:t>
+      </w:r>
+    </w:p>
+    <w:p>
+      <w:pPr>
+        <w:ind w:left="360"/>
+        <w:jc w:val="both"/>
+        <w:rPr>
+          <w:sz w:val="36"/>
+          <w:szCs w:val="36"/>
+        </w:rPr>
+      </w:pPr>
+      <w:r>
+        <w:rPr>
+          <w:sz w:val="36"/>
+          <w:szCs w:val="36"/>
+        </w:rPr>
+        <w:t>A notification will also appear in Home Assistant confirming the value captured at the start of the charge. Once the end of charging is detected, the remaining sensor’s icons will return to the colours depicted above and their states will display the charge session data captured.</w:t>
+      </w:r>
+      <w:r>
+        <w:rPr>
+          <w:sz w:val="36"/>
+          <w:szCs w:val="36"/>
+        </w:rPr>
+        <w:t xml:space="preserve"> A notification will also appear, with the end of charge captured data</w:t>
+      </w:r>
+    </w:p>
+    <w:p>
+      <w:pPr>
+        <w:ind w:left="360"/>
+        <w:jc w:val="both"/>
+        <w:rPr>
+          <w:sz w:val="36"/>
+          <w:szCs w:val="36"/>
+        </w:rPr>
+      </w:pPr>
+      <w:r>
+        <w:rPr>
+          <w:sz w:val="36"/>
+          <w:szCs w:val="36"/>
+        </w:rPr>
+        <w:t xml:space="preserve">In the case of </w:t>
+      </w:r>
+    </w:p>
+    <w:p>
+      <w:pPr>
+        <w:ind w:left="360"/>
+        <w:jc w:val="both"/>
+        <w:rPr>
+          <w:sz w:val="36"/>
+          <w:szCs w:val="36"/>
+        </w:rPr>
+      </w:pPr>
+      <w:r>
+        <w:rPr>
+          <w:sz w:val="36"/>
+          <w:szCs w:val="36"/>
+        </w:rPr>
+        <w:t>“Initial”</w:t>
+      </w:r>
+    </w:p>
+    <w:p>
+      <w:pPr>
+        <w:ind w:left="360"/>
+        <w:jc w:val="both"/>
+        <w:rPr>
+          <w:sz w:val="36"/>
+          <w:szCs w:val="36"/>
+        </w:rPr>
+      </w:pPr>
+      <w:r>
+        <w:rPr>
+          <w:sz w:val="36"/>
+          <w:szCs w:val="36"/>
+        </w:rPr>
+        <w:t xml:space="preserve">This value represents the value the Home Charger initially output to the car at the moment charging began. </w:t>
+      </w:r>
+    </w:p>
+    <w:p>
+      <w:pPr>
+        <w:ind w:left="360"/>
+        <w:jc w:val="both"/>
+        <w:rPr>
+          <w:sz w:val="36"/>
+          <w:szCs w:val="36"/>
+        </w:rPr>
+      </w:pPr>
+      <w:r>
+        <w:rPr>
+          <w:sz w:val="36"/>
+          <w:szCs w:val="36"/>
+        </w:rPr>
+        <w:t>“</w:t>
       </w:r>
       <w:proofErr w:type="spellStart"/>
       <w:r>
@@ -4081,7 +4405,7 @@
           <w:sz w:val="36"/>
           <w:szCs w:val="36"/>
         </w:rPr>
-        <w:t>self explanatory</w:t>
+        <w:t>Avg</w:t>
       </w:r>
       <w:proofErr w:type="spellEnd"/>
       <w:r>
@@ -4089,24 +4413,812 @@
           <w:sz w:val="36"/>
           <w:szCs w:val="36"/>
         </w:rPr>
-        <w:t xml:space="preserve"> such as start/end soc, total etc.</w:t>
-      </w:r>
-    </w:p>
-    <w:p>
-      <w:pPr>
-        <w:ind w:left="360"/>
-        <w:jc w:val="both"/>
-        <w:rPr>
-          <w:sz w:val="36"/>
-          <w:szCs w:val="36"/>
-        </w:rPr>
-      </w:pPr>
-      <w:r>
-        <w:rPr>
-          <w:sz w:val="36"/>
-          <w:szCs w:val="36"/>
-        </w:rPr>
-        <w:t xml:space="preserve">When the start of a charge is detected, the Start SOC (78% as shown in the example above) will reflect the value </w:t>
+        <w:t>”</w:t>
+      </w:r>
+    </w:p>
+    <w:p>
+      <w:pPr>
+        <w:ind w:left="360"/>
+        <w:jc w:val="both"/>
+        <w:rPr>
+          <w:sz w:val="36"/>
+          <w:szCs w:val="36"/>
+        </w:rPr>
+      </w:pPr>
+      <w:r>
+        <w:rPr>
+          <w:sz w:val="36"/>
+          <w:szCs w:val="36"/>
+        </w:rPr>
+        <w:t>This value represents the average value of power delivered by the charger over the duration of the charge</w:t>
+      </w:r>
+      <w:r>
+        <w:rPr>
+          <w:sz w:val="36"/>
+          <w:szCs w:val="36"/>
+        </w:rPr>
+        <w:t>.</w:t>
+      </w:r>
+    </w:p>
+    <w:p>
+      <w:pPr>
+        <w:ind w:left="360"/>
+        <w:jc w:val="both"/>
+        <w:rPr>
+          <w:sz w:val="36"/>
+          <w:szCs w:val="36"/>
+        </w:rPr>
+      </w:pPr>
+      <w:r>
+        <w:rPr>
+          <w:sz w:val="36"/>
+          <w:szCs w:val="36"/>
+        </w:rPr>
+        <w:t>If public charging “Initial” and “</w:t>
+      </w:r>
+      <w:proofErr w:type="spellStart"/>
+      <w:r>
+        <w:rPr>
+          <w:sz w:val="36"/>
+          <w:szCs w:val="36"/>
+        </w:rPr>
+        <w:t>Avg</w:t>
+      </w:r>
+      <w:proofErr w:type="spellEnd"/>
+      <w:r>
+        <w:rPr>
+          <w:sz w:val="36"/>
+          <w:szCs w:val="36"/>
+        </w:rPr>
+        <w:t xml:space="preserve">” will be computed averages, based on SOC change and Duration, if these cannot be calculated both will </w:t>
+      </w:r>
+      <w:proofErr w:type="gramStart"/>
+      <w:r>
+        <w:rPr>
+          <w:sz w:val="36"/>
+          <w:szCs w:val="36"/>
+        </w:rPr>
+        <w:t>display</w:t>
+      </w:r>
+      <w:r>
+        <w:rPr>
+          <w:sz w:val="36"/>
+          <w:szCs w:val="36"/>
+        </w:rPr>
+        <w:t xml:space="preserve"> ”Public</w:t>
+      </w:r>
+      <w:proofErr w:type="gramEnd"/>
+      <w:r>
+        <w:rPr>
+          <w:sz w:val="36"/>
+          <w:szCs w:val="36"/>
+        </w:rPr>
+        <w:t>” as their state.</w:t>
+      </w:r>
+    </w:p>
+    <w:p>
+      <w:pPr>
+        <w:ind w:left="360"/>
+        <w:jc w:val="both"/>
+        <w:rPr>
+          <w:sz w:val="36"/>
+          <w:szCs w:val="36"/>
+        </w:rPr>
+      </w:pPr>
+      <w:r>
+        <w:rPr>
+          <w:sz w:val="36"/>
+          <w:szCs w:val="36"/>
+        </w:rPr>
+        <w:t xml:space="preserve">“Uplift” </w:t>
+      </w:r>
+    </w:p>
+    <w:p>
+      <w:pPr>
+        <w:ind w:left="360"/>
+        <w:jc w:val="both"/>
+        <w:rPr>
+          <w:sz w:val="36"/>
+          <w:szCs w:val="36"/>
+        </w:rPr>
+      </w:pPr>
+      <w:r>
+        <w:rPr>
+          <w:sz w:val="36"/>
+          <w:szCs w:val="36"/>
+        </w:rPr>
+        <w:t xml:space="preserve">This is derived from the API and differs from energy gained, (which simply compares start/end energy levels to display a value, in the example above 11.4 kWh). The uplift figure is often referred to by Renault as “energy stored” and is the amount calculated as delivered to the car’s battery taking </w:t>
+      </w:r>
+      <w:r>
+        <w:rPr>
+          <w:sz w:val="36"/>
+          <w:szCs w:val="36"/>
+        </w:rPr>
+        <w:lastRenderedPageBreak/>
+        <w:t xml:space="preserve">into account BMS rate limiting/capping and any losses, hence why it differs from energy gained. You will see the same figures reflected in the charging history section of both the My Renault and </w:t>
+      </w:r>
+      <w:proofErr w:type="spellStart"/>
+      <w:r>
+        <w:rPr>
+          <w:sz w:val="36"/>
+          <w:szCs w:val="36"/>
+        </w:rPr>
+        <w:t>Kelec</w:t>
+      </w:r>
+      <w:proofErr w:type="spellEnd"/>
+      <w:r>
+        <w:rPr>
+          <w:sz w:val="36"/>
+          <w:szCs w:val="36"/>
+        </w:rPr>
+        <w:t xml:space="preserve"> apps.</w:t>
+      </w:r>
+    </w:p>
+    <w:p>
+      <w:pPr>
+        <w:ind w:left="360"/>
+        <w:jc w:val="both"/>
+        <w:rPr>
+          <w:sz w:val="36"/>
+          <w:szCs w:val="36"/>
+        </w:rPr>
+      </w:pPr>
+      <w:r>
+        <w:rPr>
+          <w:sz w:val="36"/>
+          <w:szCs w:val="36"/>
+        </w:rPr>
+        <w:t>“Type”</w:t>
+      </w:r>
+    </w:p>
+    <w:p>
+      <w:pPr>
+        <w:ind w:left="360"/>
+        <w:jc w:val="both"/>
+        <w:rPr>
+          <w:sz w:val="36"/>
+          <w:szCs w:val="36"/>
+        </w:rPr>
+      </w:pPr>
+      <w:r>
+        <w:rPr>
+          <w:sz w:val="36"/>
+          <w:szCs w:val="36"/>
+        </w:rPr>
+        <w:t>This sensor looks at the duration of the charge and the amount of energy gained in that time</w:t>
+      </w:r>
+      <w:r>
+        <w:rPr>
+          <w:sz w:val="36"/>
+          <w:szCs w:val="36"/>
+        </w:rPr>
+        <w:t>,</w:t>
+      </w:r>
+      <w:r>
+        <w:rPr>
+          <w:sz w:val="36"/>
+          <w:szCs w:val="36"/>
+        </w:rPr>
+        <w:t xml:space="preserve"> to derive one of f</w:t>
+      </w:r>
+      <w:r>
+        <w:rPr>
+          <w:sz w:val="36"/>
+          <w:szCs w:val="36"/>
+        </w:rPr>
+        <w:t>ive</w:t>
+      </w:r>
+      <w:r>
+        <w:rPr>
+          <w:sz w:val="36"/>
+          <w:szCs w:val="36"/>
+        </w:rPr>
+        <w:t xml:space="preserve"> values</w:t>
+      </w:r>
+      <w:r>
+        <w:rPr>
+          <w:sz w:val="36"/>
+          <w:szCs w:val="36"/>
+        </w:rPr>
+        <w:t xml:space="preserve"> that it can display</w:t>
+      </w:r>
+      <w:r>
+        <w:rPr>
+          <w:sz w:val="36"/>
+          <w:szCs w:val="36"/>
+        </w:rPr>
+        <w:t>:</w:t>
+      </w:r>
+    </w:p>
+    <w:p>
+      <w:pPr>
+        <w:ind w:left="360"/>
+        <w:jc w:val="both"/>
+        <w:rPr>
+          <w:sz w:val="36"/>
+          <w:szCs w:val="36"/>
+        </w:rPr>
+      </w:pPr>
+      <w:r>
+        <w:rPr>
+          <w:sz w:val="36"/>
+          <w:szCs w:val="36"/>
+        </w:rPr>
+        <w:t>‘</w:t>
+      </w:r>
+      <w:r>
+        <w:rPr>
+          <w:sz w:val="36"/>
+          <w:szCs w:val="36"/>
+        </w:rPr>
+        <w:t>Rapid DC</w:t>
+      </w:r>
+      <w:r>
+        <w:rPr>
+          <w:sz w:val="36"/>
+          <w:szCs w:val="36"/>
+        </w:rPr>
+        <w:t>’</w:t>
+      </w:r>
+      <w:r>
+        <w:rPr>
+          <w:sz w:val="36"/>
+          <w:szCs w:val="36"/>
+        </w:rPr>
+        <w:t xml:space="preserve">, </w:t>
+      </w:r>
+      <w:r>
+        <w:rPr>
+          <w:sz w:val="36"/>
+          <w:szCs w:val="36"/>
+        </w:rPr>
+        <w:t>‘</w:t>
+      </w:r>
+      <w:r>
+        <w:rPr>
+          <w:sz w:val="36"/>
+          <w:szCs w:val="36"/>
+        </w:rPr>
+        <w:t>Fast DC</w:t>
+      </w:r>
+      <w:r>
+        <w:rPr>
+          <w:sz w:val="36"/>
+          <w:szCs w:val="36"/>
+        </w:rPr>
+        <w:t>’</w:t>
+      </w:r>
+      <w:r>
+        <w:rPr>
+          <w:sz w:val="36"/>
+          <w:szCs w:val="36"/>
+        </w:rPr>
+        <w:t xml:space="preserve">, </w:t>
+      </w:r>
+      <w:r>
+        <w:rPr>
+          <w:sz w:val="36"/>
+          <w:szCs w:val="36"/>
+        </w:rPr>
+        <w:t>‘</w:t>
+      </w:r>
+      <w:r>
+        <w:rPr>
+          <w:sz w:val="36"/>
+          <w:szCs w:val="36"/>
+        </w:rPr>
+        <w:t>Fast AC</w:t>
+      </w:r>
+      <w:r>
+        <w:rPr>
+          <w:sz w:val="36"/>
+          <w:szCs w:val="36"/>
+        </w:rPr>
+        <w:t>’ or</w:t>
+      </w:r>
+      <w:r>
+        <w:rPr>
+          <w:sz w:val="36"/>
+          <w:szCs w:val="36"/>
+        </w:rPr>
+        <w:t xml:space="preserve"> </w:t>
+      </w:r>
+      <w:r>
+        <w:rPr>
+          <w:sz w:val="36"/>
+          <w:szCs w:val="36"/>
+        </w:rPr>
+        <w:t>‘</w:t>
+      </w:r>
+      <w:r>
+        <w:rPr>
+          <w:sz w:val="36"/>
+          <w:szCs w:val="36"/>
+        </w:rPr>
+        <w:t>Slow AC</w:t>
+      </w:r>
+      <w:r>
+        <w:rPr>
+          <w:sz w:val="36"/>
+          <w:szCs w:val="36"/>
+        </w:rPr>
+        <w:t xml:space="preserve">’ </w:t>
+      </w:r>
+    </w:p>
+    <w:p>
+      <w:pPr>
+        <w:ind w:left="360"/>
+        <w:jc w:val="both"/>
+        <w:rPr>
+          <w:sz w:val="36"/>
+          <w:szCs w:val="36"/>
+        </w:rPr>
+      </w:pPr>
+      <w:r>
+        <w:rPr>
+          <w:sz w:val="36"/>
+          <w:szCs w:val="36"/>
+        </w:rPr>
+        <w:t>If it cannot determine a value (occasionally this can occur when public charging), it will display “Not Rated” and its icon will change to an alert symbol and turn red.</w:t>
+      </w:r>
+    </w:p>
+    <w:p>
+      <w:pPr>
+        <w:ind w:left="360"/>
+        <w:jc w:val="both"/>
+        <w:rPr>
+          <w:sz w:val="36"/>
+          <w:szCs w:val="36"/>
+        </w:rPr>
+      </w:pPr>
+      <w:r>
+        <w:rPr>
+          <w:sz w:val="36"/>
+          <w:szCs w:val="36"/>
+        </w:rPr>
+        <w:t>Depending on the calculation it makes, will denote the icon colour:</w:t>
+      </w:r>
+    </w:p>
+    <w:p>
+      <w:pPr>
+        <w:ind w:left="360"/>
+        <w:jc w:val="both"/>
+        <w:rPr>
+          <w:sz w:val="36"/>
+          <w:szCs w:val="36"/>
+        </w:rPr>
+      </w:pPr>
+      <w:r>
+        <w:rPr>
+          <w:sz w:val="36"/>
+          <w:szCs w:val="36"/>
+        </w:rPr>
+        <w:t>‘Rapid DC’, green</w:t>
+      </w:r>
+    </w:p>
+    <w:p>
+      <w:pPr>
+        <w:ind w:left="360"/>
+        <w:jc w:val="both"/>
+        <w:rPr>
+          <w:sz w:val="36"/>
+          <w:szCs w:val="36"/>
+        </w:rPr>
+      </w:pPr>
+      <w:r>
+        <w:rPr>
+          <w:sz w:val="36"/>
+          <w:szCs w:val="36"/>
+        </w:rPr>
+        <w:t>‘Fast DC’, orange</w:t>
+      </w:r>
+    </w:p>
+    <w:p>
+      <w:pPr>
+        <w:ind w:left="360"/>
+        <w:jc w:val="both"/>
+        <w:rPr>
+          <w:sz w:val="36"/>
+          <w:szCs w:val="36"/>
+        </w:rPr>
+      </w:pPr>
+      <w:r>
+        <w:rPr>
+          <w:sz w:val="36"/>
+          <w:szCs w:val="36"/>
+        </w:rPr>
+        <w:t>‘Fast AC’ yellow</w:t>
+      </w:r>
+    </w:p>
+    <w:p>
+      <w:pPr>
+        <w:ind w:left="360"/>
+        <w:jc w:val="both"/>
+        <w:rPr>
+          <w:sz w:val="36"/>
+          <w:szCs w:val="36"/>
+        </w:rPr>
+      </w:pPr>
+      <w:r>
+        <w:rPr>
+          <w:sz w:val="36"/>
+          <w:szCs w:val="36"/>
+        </w:rPr>
+        <w:t>‘Slow AC’, red</w:t>
+      </w:r>
+    </w:p>
+    <w:p>
+      <w:pPr>
+        <w:ind w:left="360"/>
+        <w:jc w:val="both"/>
+        <w:rPr>
+          <w:sz w:val="36"/>
+          <w:szCs w:val="36"/>
+        </w:rPr>
+      </w:pPr>
+      <w:r>
+        <w:rPr>
+          <w:sz w:val="36"/>
+          <w:szCs w:val="36"/>
+        </w:rPr>
+        <w:t>“Status”</w:t>
+      </w:r>
+    </w:p>
+    <w:p>
+      <w:pPr>
+        <w:ind w:left="360"/>
+        <w:jc w:val="both"/>
+        <w:rPr>
+          <w:sz w:val="36"/>
+          <w:szCs w:val="36"/>
+        </w:rPr>
+      </w:pPr>
+      <w:r>
+        <w:rPr>
+          <w:sz w:val="36"/>
+          <w:szCs w:val="36"/>
+        </w:rPr>
+        <w:t>This sensor denotes the end of charge session status and is reported by the API. It should show “Completed” if no errors were detected during the charge or “Failed” if an error was detected or “N/A” if it cannot determine the end of charge status.</w:t>
+      </w:r>
+    </w:p>
+    <w:p>
+      <w:pPr>
+        <w:ind w:left="360"/>
+        <w:jc w:val="both"/>
+        <w:rPr>
+          <w:sz w:val="36"/>
+          <w:szCs w:val="36"/>
+        </w:rPr>
+      </w:pPr>
+      <w:r>
+        <w:rPr>
+          <w:sz w:val="36"/>
+          <w:szCs w:val="36"/>
+        </w:rPr>
+        <w:lastRenderedPageBreak/>
+        <w:t xml:space="preserve">“Charge Date” </w:t>
+      </w:r>
+    </w:p>
+    <w:p>
+      <w:pPr>
+        <w:ind w:left="360"/>
+        <w:jc w:val="both"/>
+        <w:rPr>
+          <w:sz w:val="36"/>
+          <w:szCs w:val="36"/>
+        </w:rPr>
+      </w:pPr>
+      <w:r>
+        <w:rPr>
+          <w:sz w:val="36"/>
+          <w:szCs w:val="36"/>
+        </w:rPr>
+        <w:t>Shows the date the start of charge was captured</w:t>
+      </w:r>
+    </w:p>
+    <w:p>
+      <w:pPr>
+        <w:ind w:left="360"/>
+        <w:jc w:val="both"/>
+        <w:rPr>
+          <w:sz w:val="36"/>
+          <w:szCs w:val="36"/>
+        </w:rPr>
+      </w:pPr>
+    </w:p>
+    <w:p>
+      <w:pPr>
+        <w:ind w:left="360"/>
+        <w:jc w:val="both"/>
+        <w:rPr>
+          <w:sz w:val="36"/>
+          <w:szCs w:val="36"/>
+          <w:u w:val="single"/>
+        </w:rPr>
+      </w:pPr>
+      <w:r>
+        <w:rPr>
+          <w:sz w:val="36"/>
+          <w:szCs w:val="36"/>
+          <w:u w:val="single"/>
+        </w:rPr>
+        <w:t>Column 3: “Update/Test/Errors”</w:t>
+      </w:r>
+    </w:p>
+    <w:p>
+      <w:pPr>
+        <w:ind w:left="360"/>
+        <w:jc w:val="both"/>
+        <w:rPr>
+          <w:sz w:val="36"/>
+          <w:szCs w:val="36"/>
+        </w:rPr>
+      </w:pPr>
+      <w:r>
+        <w:rPr>
+          <w:sz w:val="36"/>
+          <w:szCs w:val="36"/>
+        </w:rPr>
+        <w:t>This section is made up of</w:t>
+      </w:r>
+      <w:r>
+        <w:rPr>
+          <w:sz w:val="36"/>
+          <w:szCs w:val="36"/>
+        </w:rPr>
+        <w:t xml:space="preserve"> seven buttons some of which are hidden and only appear conditionally</w:t>
+      </w:r>
+    </w:p>
+    <w:p>
+      <w:pPr>
+        <w:ind w:left="360"/>
+        <w:jc w:val="both"/>
+        <w:rPr>
+          <w:sz w:val="36"/>
+          <w:szCs w:val="36"/>
+        </w:rPr>
+      </w:pPr>
+      <w:r>
+        <w:rPr>
+          <w:sz w:val="36"/>
+          <w:szCs w:val="36"/>
+        </w:rPr>
+        <w:t>“Soft Update”</w:t>
+      </w:r>
+    </w:p>
+    <w:p>
+      <w:pPr>
+        <w:ind w:left="360"/>
+        <w:jc w:val="both"/>
+        <w:rPr>
+          <w:sz w:val="36"/>
+          <w:szCs w:val="36"/>
+        </w:rPr>
+      </w:pPr>
+      <w:r>
+        <w:rPr>
+          <w:sz w:val="36"/>
+          <w:szCs w:val="36"/>
+        </w:rPr>
+        <w:t>This button forces an update of the RAW sensors by calling the Renault API. When you click on it, a pop</w:t>
+      </w:r>
+      <w:r>
+        <w:rPr>
+          <w:sz w:val="36"/>
+          <w:szCs w:val="36"/>
+        </w:rPr>
+        <w:t>-</w:t>
+      </w:r>
+      <w:r>
+        <w:rPr>
+          <w:sz w:val="36"/>
+          <w:szCs w:val="36"/>
+        </w:rPr>
+        <w:t>up dialog appears explaining what a soft update entails and how it works</w:t>
+      </w:r>
+      <w:r>
+        <w:rPr>
+          <w:sz w:val="36"/>
+          <w:szCs w:val="36"/>
+        </w:rPr>
+        <w:t>,</w:t>
+      </w:r>
+      <w:r>
+        <w:rPr>
+          <w:sz w:val="36"/>
+          <w:szCs w:val="36"/>
+        </w:rPr>
+        <w:t xml:space="preserve"> as well as a warning. To execute the update a button will appear in the pop</w:t>
+      </w:r>
+      <w:r>
+        <w:rPr>
+          <w:sz w:val="36"/>
+          <w:szCs w:val="36"/>
+        </w:rPr>
+        <w:t>-</w:t>
+      </w:r>
+      <w:r>
+        <w:rPr>
+          <w:sz w:val="36"/>
+          <w:szCs w:val="36"/>
+        </w:rPr>
+        <w:t xml:space="preserve">up for you to action the update. </w:t>
+      </w:r>
+      <w:proofErr w:type="gramStart"/>
+      <w:r>
+        <w:rPr>
+          <w:sz w:val="36"/>
+          <w:szCs w:val="36"/>
+        </w:rPr>
+        <w:t>Typically</w:t>
+      </w:r>
+      <w:proofErr w:type="gramEnd"/>
+      <w:r>
+        <w:rPr>
+          <w:sz w:val="36"/>
+          <w:szCs w:val="36"/>
+        </w:rPr>
+        <w:t xml:space="preserve"> you might use this if you saw any of the sensors reporting (S) stale data or (D) derived data from cache values.</w:t>
+      </w:r>
+    </w:p>
+    <w:p>
+      <w:pPr>
+        <w:ind w:left="360"/>
+        <w:jc w:val="both"/>
+        <w:rPr>
+          <w:sz w:val="36"/>
+          <w:szCs w:val="36"/>
+        </w:rPr>
+      </w:pPr>
+      <w:r>
+        <w:rPr>
+          <w:sz w:val="36"/>
+          <w:szCs w:val="36"/>
+        </w:rPr>
+        <w:t>“Run Test Charge”</w:t>
+      </w:r>
+    </w:p>
+    <w:p>
+      <w:pPr>
+        <w:ind w:left="360"/>
+        <w:jc w:val="both"/>
+        <w:rPr>
+          <w:sz w:val="36"/>
+          <w:szCs w:val="36"/>
+        </w:rPr>
+      </w:pPr>
+      <w:r>
+        <w:rPr>
+          <w:sz w:val="36"/>
+          <w:szCs w:val="36"/>
+        </w:rPr>
+        <w:t>This button will launch a 5 min test charge to prove the logic of the system. Note that it is inhibited during a real charge session or once a test charge has started. When you start a test charge the “Last Charge” block of sensors is replaced by another “Test Charge” block of sensors. All will be greyed out with flask icons</w:t>
+      </w:r>
+      <w:r>
+        <w:rPr>
+          <w:sz w:val="36"/>
+          <w:szCs w:val="36"/>
+        </w:rPr>
+        <w:t>,</w:t>
+      </w:r>
+      <w:r>
+        <w:rPr>
+          <w:sz w:val="36"/>
+          <w:szCs w:val="36"/>
+        </w:rPr>
+        <w:t xml:space="preserve"> pulsing in red. Similarly, over in the “Vehicle Status” sensor block, the Charger Plug, Charging Status, Charging Rate, Time Left and Charger Flap sensors </w:t>
+      </w:r>
+      <w:r>
+        <w:rPr>
+          <w:sz w:val="36"/>
+          <w:szCs w:val="36"/>
+        </w:rPr>
+        <w:lastRenderedPageBreak/>
+        <w:t>will also change icons to a flask and pulse red with their test states displayed (as discussed earlier in this user guide)</w:t>
+      </w:r>
+    </w:p>
+    <w:p>
+      <w:pPr>
+        <w:ind w:left="360"/>
+        <w:jc w:val="both"/>
+        <w:rPr>
+          <w:sz w:val="36"/>
+          <w:szCs w:val="36"/>
+        </w:rPr>
+      </w:pPr>
+      <w:r>
+        <w:rPr>
+          <w:sz w:val="36"/>
+          <w:szCs w:val="36"/>
+        </w:rPr>
+        <w:t>Whilst a test charge is running the button will ch</w:t>
+      </w:r>
+      <w:r>
+        <w:rPr>
+          <w:sz w:val="36"/>
+          <w:szCs w:val="36"/>
+        </w:rPr>
+        <w:t>a</w:t>
+      </w:r>
+      <w:r>
+        <w:rPr>
+          <w:sz w:val="36"/>
+          <w:szCs w:val="36"/>
+        </w:rPr>
+        <w:t xml:space="preserve">nge to an </w:t>
+      </w:r>
+      <w:r>
+        <w:rPr>
+          <w:sz w:val="36"/>
+          <w:szCs w:val="36"/>
+        </w:rPr>
+        <w:t xml:space="preserve">animated </w:t>
+      </w:r>
+      <w:r>
+        <w:rPr>
+          <w:sz w:val="36"/>
+          <w:szCs w:val="36"/>
+        </w:rPr>
+        <w:t>egg timer icon in green, showing the time remaining until the test charge completes. At the end of the test charge</w:t>
+      </w:r>
+      <w:r>
+        <w:rPr>
+          <w:sz w:val="36"/>
+          <w:szCs w:val="36"/>
+        </w:rPr>
+        <w:t>,</w:t>
+      </w:r>
+      <w:r>
+        <w:rPr>
+          <w:sz w:val="36"/>
+          <w:szCs w:val="36"/>
+        </w:rPr>
+        <w:t xml:space="preserve"> all icons will return to their normal </w:t>
+      </w:r>
+      <w:r>
+        <w:rPr>
+          <w:sz w:val="36"/>
+          <w:szCs w:val="36"/>
+        </w:rPr>
+        <w:t xml:space="preserve">type and </w:t>
+      </w:r>
+      <w:r>
+        <w:rPr>
+          <w:sz w:val="36"/>
+          <w:szCs w:val="36"/>
+        </w:rPr>
+        <w:t>colour. The Vehicle Status sensors, will display their original values and the Test Charge values will continue to be displayed for one minute, during which time the egg time</w:t>
+      </w:r>
+      <w:r>
+        <w:rPr>
+          <w:sz w:val="36"/>
+          <w:szCs w:val="36"/>
+        </w:rPr>
+        <w:t>r</w:t>
+      </w:r>
+      <w:r>
+        <w:rPr>
+          <w:sz w:val="36"/>
+          <w:szCs w:val="36"/>
+        </w:rPr>
+        <w:t xml:space="preserve"> button is replaced by an “Auto Reset” button that counts down for 1 minute. At the end of this minute the “Test Charge” card will be replaced by the “Last Charge” card with all the last charge data intact and the Run Test Charge button will reappear.</w:t>
+      </w:r>
+    </w:p>
+    <w:p>
+      <w:pPr>
+        <w:ind w:left="360"/>
+        <w:jc w:val="both"/>
+        <w:rPr>
+          <w:sz w:val="36"/>
+          <w:szCs w:val="36"/>
+        </w:rPr>
+      </w:pPr>
+      <w:r>
+        <w:rPr>
+          <w:sz w:val="36"/>
+          <w:szCs w:val="36"/>
+        </w:rPr>
+        <w:t xml:space="preserve">Note that values generated during the test are partly </w:t>
       </w:r>
       <w:r>
         <w:rPr>
@@ -4120,142 +5232,198 @@
           <w:sz w:val="36"/>
           <w:szCs w:val="36"/>
         </w:rPr>
-        <w:t xml:space="preserve"> at that moment, similarly the same applies to</w:t>
-      </w:r>
-      <w:r>
-        <w:rPr>
-          <w:sz w:val="36"/>
-          <w:szCs w:val="36"/>
-        </w:rPr>
-        <w:t xml:space="preserve"> the </w:t>
-      </w:r>
-      <w:r>
-        <w:rPr>
-          <w:sz w:val="36"/>
-          <w:szCs w:val="36"/>
-        </w:rPr>
-        <w:t>start energy</w:t>
-      </w:r>
-      <w:r>
-        <w:rPr>
-          <w:sz w:val="36"/>
-          <w:szCs w:val="36"/>
-        </w:rPr>
-        <w:t xml:space="preserve"> value</w:t>
-      </w:r>
-      <w:r>
-        <w:rPr>
-          <w:sz w:val="36"/>
-          <w:szCs w:val="36"/>
-        </w:rPr>
-        <w:t xml:space="preserve"> (40.6 kWh as shown in the example above and the Initial power from the charger</w:t>
-      </w:r>
-      <w:r>
-        <w:rPr>
-          <w:sz w:val="36"/>
-          <w:szCs w:val="36"/>
-        </w:rPr>
-        <w:t xml:space="preserve"> 6.0 kw). ALL the remaining sensor’s icons will turn grey and their states will show “Wait…”</w:t>
-      </w:r>
-      <w:r>
-        <w:rPr>
-          <w:sz w:val="36"/>
-          <w:szCs w:val="36"/>
-        </w:rPr>
-        <w:t xml:space="preserve"> for the duration of the charge</w:t>
-      </w:r>
-      <w:r>
-        <w:rPr>
-          <w:sz w:val="36"/>
-          <w:szCs w:val="36"/>
-        </w:rPr>
-        <w:t xml:space="preserve">. </w:t>
-      </w:r>
-    </w:p>
-    <w:p>
-      <w:pPr>
-        <w:ind w:left="360"/>
-        <w:jc w:val="both"/>
-        <w:rPr>
-          <w:sz w:val="36"/>
-          <w:szCs w:val="36"/>
-        </w:rPr>
-      </w:pPr>
-      <w:r>
-        <w:rPr>
-          <w:sz w:val="36"/>
-          <w:szCs w:val="36"/>
-        </w:rPr>
-        <w:t>A notification will also appear in Home Assistant confirming the value captured at the start of the charge. Once the end of charging is detected, the remaining sensor’s icons will return to the colours depicted above and their states will display the charge session data captured.</w:t>
-      </w:r>
-      <w:r>
-        <w:rPr>
-          <w:sz w:val="36"/>
-          <w:szCs w:val="36"/>
-        </w:rPr>
-        <w:t xml:space="preserve"> A notification will also appear, with the end of charge captured data</w:t>
-      </w:r>
-    </w:p>
-    <w:p>
-      <w:pPr>
-        <w:ind w:left="360"/>
-        <w:jc w:val="both"/>
-        <w:rPr>
-          <w:sz w:val="36"/>
-          <w:szCs w:val="36"/>
-        </w:rPr>
-      </w:pPr>
-      <w:r>
-        <w:rPr>
-          <w:sz w:val="36"/>
-          <w:szCs w:val="36"/>
-        </w:rPr>
-        <w:t xml:space="preserve">In the case of </w:t>
-      </w:r>
-    </w:p>
-    <w:p>
-      <w:pPr>
-        <w:ind w:left="360"/>
-        <w:jc w:val="both"/>
-        <w:rPr>
-          <w:sz w:val="36"/>
-          <w:szCs w:val="36"/>
-        </w:rPr>
-      </w:pPr>
-      <w:r>
-        <w:rPr>
-          <w:sz w:val="36"/>
-          <w:szCs w:val="36"/>
-        </w:rPr>
-        <w:t>“Initial”</w:t>
-      </w:r>
-    </w:p>
-    <w:p>
-      <w:pPr>
-        <w:ind w:left="360"/>
-        <w:jc w:val="both"/>
-        <w:rPr>
-          <w:sz w:val="36"/>
-          <w:szCs w:val="36"/>
-        </w:rPr>
-      </w:pPr>
-      <w:r>
-        <w:rPr>
-          <w:sz w:val="36"/>
-          <w:szCs w:val="36"/>
-        </w:rPr>
-        <w:t xml:space="preserve">This value represents the value the Home Charger initially output to the car at the moment charging began. </w:t>
-      </w:r>
-    </w:p>
-    <w:p>
-      <w:pPr>
-        <w:ind w:left="360"/>
-        <w:jc w:val="both"/>
-        <w:rPr>
-          <w:sz w:val="36"/>
-          <w:szCs w:val="36"/>
-        </w:rPr>
-      </w:pPr>
+        <w:t xml:space="preserve"> and partly fixed notional ones, simply to exercise the logic and ensure everything is working properly, in anticipation of a real charge session. You do NOT need to run the test ordinarily.</w:t>
+      </w:r>
+    </w:p>
+    <w:p>
+      <w:pPr>
+        <w:ind w:left="360"/>
+        <w:jc w:val="both"/>
+        <w:rPr>
+          <w:sz w:val="36"/>
+          <w:szCs w:val="36"/>
+        </w:rPr>
+      </w:pPr>
+      <w:r>
+        <w:rPr>
+          <w:sz w:val="36"/>
+          <w:szCs w:val="36"/>
+        </w:rPr>
+        <w:t xml:space="preserve">Three further buttons can appear under certain </w:t>
+      </w:r>
+      <w:proofErr w:type="spellStart"/>
+      <w:r>
+        <w:rPr>
+          <w:sz w:val="36"/>
+          <w:szCs w:val="36"/>
+        </w:rPr>
+        <w:t>circimstances</w:t>
+      </w:r>
+      <w:proofErr w:type="spellEnd"/>
+      <w:r>
+        <w:rPr>
+          <w:sz w:val="36"/>
+          <w:szCs w:val="36"/>
+        </w:rPr>
+        <w:t>:</w:t>
+      </w:r>
+    </w:p>
+    <w:p>
+      <w:pPr>
+        <w:ind w:left="360"/>
+        <w:jc w:val="both"/>
+        <w:rPr>
+          <w:sz w:val="36"/>
+          <w:szCs w:val="36"/>
+        </w:rPr>
+      </w:pPr>
+      <w:r>
+        <w:rPr>
+          <w:sz w:val="36"/>
+          <w:szCs w:val="36"/>
+        </w:rPr>
+        <w:t>“CLI Prompt”, “Auth Failure” and “Stale Data”</w:t>
+      </w:r>
+    </w:p>
+    <w:p>
+      <w:pPr>
+        <w:ind w:left="360"/>
+        <w:jc w:val="both"/>
+        <w:rPr>
+          <w:sz w:val="36"/>
+          <w:szCs w:val="36"/>
+        </w:rPr>
+      </w:pPr>
+      <w:r>
+        <w:rPr>
+          <w:sz w:val="36"/>
+          <w:szCs w:val="36"/>
+        </w:rPr>
+        <w:t xml:space="preserve">When an error is </w:t>
+      </w:r>
+      <w:proofErr w:type="gramStart"/>
+      <w:r>
+        <w:rPr>
+          <w:sz w:val="36"/>
+          <w:szCs w:val="36"/>
+        </w:rPr>
+        <w:t>detected</w:t>
+      </w:r>
+      <w:proofErr w:type="gramEnd"/>
+      <w:r>
+        <w:rPr>
+          <w:sz w:val="36"/>
+          <w:szCs w:val="36"/>
+        </w:rPr>
+        <w:t xml:space="preserve"> their state will change to “on” prompting them to become visible. Their icons will be in red and pulsing, denoting there is a problem. You can click on </w:t>
+      </w:r>
+      <w:r>
+        <w:rPr>
+          <w:sz w:val="36"/>
+          <w:szCs w:val="36"/>
+        </w:rPr>
+        <w:lastRenderedPageBreak/>
+        <w:t>each of them, which will bring up a pop</w:t>
+      </w:r>
+      <w:r>
+        <w:rPr>
+          <w:sz w:val="36"/>
+          <w:szCs w:val="36"/>
+        </w:rPr>
+        <w:t>-</w:t>
+      </w:r>
+      <w:r>
+        <w:rPr>
+          <w:sz w:val="36"/>
+          <w:szCs w:val="36"/>
+        </w:rPr>
+        <w:t xml:space="preserve">up </w:t>
+      </w:r>
+      <w:proofErr w:type="spellStart"/>
+      <w:r>
+        <w:rPr>
+          <w:sz w:val="36"/>
+          <w:szCs w:val="36"/>
+        </w:rPr>
+        <w:t>daialog</w:t>
+      </w:r>
+      <w:proofErr w:type="spellEnd"/>
+      <w:r>
+        <w:rPr>
+          <w:sz w:val="36"/>
+          <w:szCs w:val="36"/>
+        </w:rPr>
+        <w:t xml:space="preserve"> box explaining the cause behind the error and how to deal with it.</w:t>
+      </w:r>
+    </w:p>
+    <w:p>
+      <w:pPr>
+        <w:ind w:left="360"/>
+        <w:jc w:val="both"/>
+        <w:rPr>
+          <w:sz w:val="36"/>
+          <w:szCs w:val="36"/>
+        </w:rPr>
+      </w:pPr>
+    </w:p>
+    <w:p>
+      <w:pPr>
+        <w:ind w:left="360"/>
+        <w:jc w:val="both"/>
+        <w:rPr>
+          <w:sz w:val="36"/>
+          <w:szCs w:val="36"/>
+        </w:rPr>
+      </w:pPr>
+      <w:r>
+        <w:rPr>
+          <w:sz w:val="36"/>
+          <w:szCs w:val="36"/>
+        </w:rPr>
+        <w:t xml:space="preserve">CLI Prompt: denotes that on attempting to retrieve data from Renault’s API to update the RAW </w:t>
+      </w:r>
+      <w:r>
+        <w:rPr>
+          <w:sz w:val="36"/>
+          <w:szCs w:val="36"/>
+        </w:rPr>
+        <w:t>sensors</w:t>
+      </w:r>
+      <w:r>
+        <w:rPr>
+          <w:sz w:val="36"/>
+          <w:szCs w:val="36"/>
+        </w:rPr>
+        <w:t xml:space="preserve"> f</w:t>
+      </w:r>
+      <w:r>
+        <w:rPr>
+          <w:sz w:val="36"/>
+          <w:szCs w:val="36"/>
+        </w:rPr>
+        <w:t>rom</w:t>
+      </w:r>
+      <w:r>
+        <w:rPr>
+          <w:sz w:val="36"/>
+          <w:szCs w:val="36"/>
+        </w:rPr>
+        <w:t xml:space="preserve"> an endpoint, the CLI prompted for interaction, usually a username or </w:t>
+      </w:r>
+      <w:r>
+        <w:rPr>
+          <w:sz w:val="36"/>
+          <w:szCs w:val="36"/>
+        </w:rPr>
+        <w:t>locale</w:t>
+      </w:r>
+      <w:r>
+        <w:rPr>
+          <w:sz w:val="36"/>
+          <w:szCs w:val="36"/>
+        </w:rPr>
+        <w:t xml:space="preserve">. Normally automation </w:t>
+      </w:r>
       <w:r>
         <w:rPr>
           <w:sz w:val="36"/>
@@ -4263,15 +5431,13 @@
         </w:rPr>
         <w:t>“</w:t>
       </w:r>
-      <w:proofErr w:type="spellStart"/>
-      <w:r>
-        <w:rPr>
-          <w:sz w:val="36"/>
-          <w:szCs w:val="36"/>
-        </w:rPr>
-        <w:t>Avg</w:t>
-      </w:r>
-      <w:proofErr w:type="spellEnd"/>
+      <w:r>
+        <w:rPr>
+          <w:sz w:val="36"/>
+          <w:szCs w:val="36"/>
+        </w:rPr>
+        <w:t>8</w:t>
+      </w:r>
       <w:r>
         <w:rPr>
           <w:sz w:val="36"/>
@@ -4279,22 +5445,75 @@
         </w:rPr>
         <w:t>”</w:t>
       </w:r>
-    </w:p>
-    <w:p>
-      <w:pPr>
-        <w:ind w:left="360"/>
-        <w:jc w:val="both"/>
-        <w:rPr>
-          <w:sz w:val="36"/>
-          <w:szCs w:val="36"/>
-        </w:rPr>
-      </w:pPr>
-      <w:r>
-        <w:rPr>
-          <w:sz w:val="36"/>
-          <w:szCs w:val="36"/>
-        </w:rPr>
-        <w:t>This value represents the average value of power delivered by the charger over the duration of the charge</w:t>
+      <w:r>
+        <w:rPr>
+          <w:sz w:val="36"/>
+          <w:szCs w:val="36"/>
+        </w:rPr>
+        <w:t xml:space="preserve"> handles this automatically for you, but it might be that you need to run it manually or login into the API yourself via the </w:t>
+      </w:r>
+      <w:r>
+        <w:rPr>
+          <w:sz w:val="36"/>
+          <w:szCs w:val="36"/>
+        </w:rPr>
+        <w:t>“</w:t>
+      </w:r>
+      <w:r>
+        <w:rPr>
+          <w:sz w:val="36"/>
+          <w:szCs w:val="36"/>
+        </w:rPr>
+        <w:t>Advance</w:t>
+      </w:r>
+      <w:r>
+        <w:rPr>
+          <w:sz w:val="36"/>
+          <w:szCs w:val="36"/>
+        </w:rPr>
+        <w:t>d</w:t>
+      </w:r>
+      <w:r>
+        <w:rPr>
+          <w:sz w:val="36"/>
+          <w:szCs w:val="36"/>
+        </w:rPr>
+        <w:t xml:space="preserve"> SSH </w:t>
+      </w:r>
+      <w:r>
+        <w:rPr>
+          <w:sz w:val="36"/>
+          <w:szCs w:val="36"/>
+        </w:rPr>
+        <w:t>&amp;</w:t>
+      </w:r>
+      <w:r>
+        <w:rPr>
+          <w:sz w:val="36"/>
+          <w:szCs w:val="36"/>
+        </w:rPr>
+        <w:t xml:space="preserve"> Web Terminal</w:t>
+      </w:r>
+      <w:r>
+        <w:rPr>
+          <w:sz w:val="36"/>
+          <w:szCs w:val="36"/>
+        </w:rPr>
+        <w:t>”</w:t>
+      </w:r>
+      <w:r>
+        <w:rPr>
+          <w:sz w:val="36"/>
+          <w:szCs w:val="36"/>
+        </w:rPr>
+        <w:t xml:space="preserve"> in Home Assistant</w:t>
+      </w:r>
+      <w:r>
+        <w:rPr>
+          <w:sz w:val="36"/>
+          <w:szCs w:val="36"/>
+        </w:rPr>
+        <w:t xml:space="preserve"> to clear the fault</w:t>
       </w:r>
       <w:r>
         <w:rPr>
@@ -4318,23 +5537,7 @@
           <w:sz w:val="36"/>
           <w:szCs w:val="36"/>
         </w:rPr>
-        <w:t>If public charging “Initial” and “</w:t>
-      </w:r>
-      <w:proofErr w:type="spellStart"/>
-      <w:r>
-        <w:rPr>
-          <w:sz w:val="36"/>
-          <w:szCs w:val="36"/>
-        </w:rPr>
-        <w:t>Avg</w:t>
-      </w:r>
-      <w:proofErr w:type="spellEnd"/>
-      <w:r>
-        <w:rPr>
-          <w:sz w:val="36"/>
-          <w:szCs w:val="36"/>
-        </w:rPr>
-        <w:t xml:space="preserve">” will be computed averages, based on SOC change and Duration, if these cannot be calculated both will </w:t>
+        <w:t xml:space="preserve">Auth Failure: denotes that authorisation has failed, possibly caused by a corrupt credentials file or some other issue. </w:t>
       </w:r>
       <w:proofErr w:type="gramStart"/>
       <w:r>
@@ -4342,14 +5545,7 @@
           <w:sz w:val="36"/>
           <w:szCs w:val="36"/>
         </w:rPr>
-        <w:t>display</w:t>
-      </w:r>
-      <w:r>
-        <w:rPr>
-          <w:sz w:val="36"/>
-          <w:szCs w:val="36"/>
-        </w:rPr>
-        <w:t xml:space="preserve"> ”Public</w:t>
+        <w:t>Again</w:t>
       </w:r>
       <w:proofErr w:type="gramEnd"/>
       <w:r>
@@ -4357,7 +5553,96 @@
           <w:sz w:val="36"/>
           <w:szCs w:val="36"/>
         </w:rPr>
-        <w:t>” as their state.</w:t>
+        <w:t xml:space="preserve"> this is usually handled by the automations, but you might need to check your credentials file or reauthenticate yourself via the Terminal.</w:t>
+      </w:r>
+    </w:p>
+    <w:p>
+      <w:pPr>
+        <w:ind w:left="360"/>
+        <w:jc w:val="both"/>
+        <w:rPr>
+          <w:sz w:val="36"/>
+          <w:szCs w:val="36"/>
+        </w:rPr>
+      </w:pPr>
+      <w:r>
+        <w:rPr>
+          <w:sz w:val="36"/>
+          <w:szCs w:val="36"/>
+        </w:rPr>
+        <w:t>Stale Data: This is usually caused by the API lagging for whatever reason</w:t>
+      </w:r>
+      <w:r>
+        <w:rPr>
+          <w:sz w:val="36"/>
+          <w:szCs w:val="36"/>
+        </w:rPr>
+        <w:t>,</w:t>
+      </w:r>
+      <w:r>
+        <w:rPr>
+          <w:sz w:val="36"/>
+          <w:szCs w:val="36"/>
+        </w:rPr>
+        <w:t xml:space="preserve"> in updating the car</w:t>
+      </w:r>
+      <w:r>
+        <w:rPr>
+          <w:sz w:val="36"/>
+          <w:szCs w:val="36"/>
+        </w:rPr>
+        <w:t>’</w:t>
+      </w:r>
+      <w:r>
+        <w:rPr>
+          <w:sz w:val="36"/>
+          <w:szCs w:val="36"/>
+        </w:rPr>
+        <w:t>s data. Automations monitor how “fresh” the data is between polling intervals and if they appear “stuck</w:t>
+      </w:r>
+      <w:r>
+        <w:rPr>
+          <w:sz w:val="36"/>
+          <w:szCs w:val="36"/>
+        </w:rPr>
+        <w:t>”</w:t>
+      </w:r>
+      <w:r>
+        <w:rPr>
+          <w:sz w:val="36"/>
+          <w:szCs w:val="36"/>
+        </w:rPr>
+        <w:t xml:space="preserve"> for a pre-determined time, then it prompts a refresh and invokes this condition causing the button to appear.</w:t>
+      </w:r>
+    </w:p>
+    <w:p>
+      <w:pPr>
+        <w:ind w:left="360"/>
+        <w:jc w:val="both"/>
+        <w:rPr>
+          <w:sz w:val="36"/>
+          <w:szCs w:val="36"/>
+        </w:rPr>
+      </w:pPr>
+    </w:p>
+    <w:p>
+      <w:pPr>
+        <w:ind w:left="360"/>
+        <w:jc w:val="both"/>
+        <w:rPr>
+          <w:sz w:val="36"/>
+          <w:szCs w:val="36"/>
+          <w:u w:val="single"/>
+        </w:rPr>
+      </w:pPr>
+      <w:bookmarkStart w:id="0" w:name="_Hlk219624376"/>
+      <w:r>
+        <w:rPr>
+          <w:sz w:val="36"/>
+          <w:szCs w:val="36"/>
+          <w:u w:val="single"/>
+        </w:rPr>
+        <w:t>Latest Update</w:t>
       </w:r>
     </w:p>
     <w:p>
@@ -4375,1102 +5660,83 @@
           <w:szCs w:val="36"/>
         </w:rPr>
         <w:lastRenderedPageBreak/>
-        <w:t xml:space="preserve">“Uplift” </w:t>
-      </w:r>
-    </w:p>
-    <w:p>
-      <w:pPr>
-        <w:ind w:left="360"/>
-        <w:jc w:val="both"/>
-        <w:rPr>
-          <w:sz w:val="36"/>
-          <w:szCs w:val="36"/>
-        </w:rPr>
-      </w:pPr>
-      <w:r>
-        <w:rPr>
-          <w:sz w:val="36"/>
-          <w:szCs w:val="36"/>
-        </w:rPr>
-        <w:t xml:space="preserve">This is derived from the API and differs from energy gained, (which simply compares start/end energy levels to display a value, in the example above 11.4 kWh). The uplift figure is often referred to by Renault as “energy stored” and is the amount calculated as delivered to the car’s battery taking into account BMS rate limiting/capping and any losses, hence why it differs from energy gained. You will see the same figures reflected in the charging history section of both the My Renault and </w:t>
-      </w:r>
-      <w:proofErr w:type="spellStart"/>
-      <w:r>
-        <w:rPr>
-          <w:sz w:val="36"/>
-          <w:szCs w:val="36"/>
-        </w:rPr>
-        <w:t>Kelec</w:t>
-      </w:r>
-      <w:proofErr w:type="spellEnd"/>
-      <w:r>
-        <w:rPr>
-          <w:sz w:val="36"/>
-          <w:szCs w:val="36"/>
-        </w:rPr>
-        <w:t xml:space="preserve"> apps.</w:t>
-      </w:r>
-    </w:p>
-    <w:p>
-      <w:pPr>
-        <w:ind w:left="360"/>
-        <w:jc w:val="both"/>
-        <w:rPr>
-          <w:sz w:val="36"/>
-          <w:szCs w:val="36"/>
-        </w:rPr>
-      </w:pPr>
-      <w:r>
-        <w:rPr>
-          <w:sz w:val="36"/>
-          <w:szCs w:val="36"/>
-        </w:rPr>
-        <w:t>“Type”</w:t>
-      </w:r>
-    </w:p>
-    <w:p>
-      <w:pPr>
-        <w:ind w:left="360"/>
-        <w:jc w:val="both"/>
-        <w:rPr>
-          <w:sz w:val="36"/>
-          <w:szCs w:val="36"/>
-        </w:rPr>
-      </w:pPr>
-      <w:r>
-        <w:rPr>
-          <w:sz w:val="36"/>
-          <w:szCs w:val="36"/>
-        </w:rPr>
-        <w:t>This sensor looks at the duration of the charge and the amount of energy gained in that time</w:t>
-      </w:r>
-      <w:r>
-        <w:rPr>
-          <w:sz w:val="36"/>
-          <w:szCs w:val="36"/>
-        </w:rPr>
-        <w:t>,</w:t>
-      </w:r>
-      <w:r>
-        <w:rPr>
-          <w:sz w:val="36"/>
-          <w:szCs w:val="36"/>
-        </w:rPr>
-        <w:t xml:space="preserve"> to derive one of f</w:t>
-      </w:r>
-      <w:r>
-        <w:rPr>
-          <w:sz w:val="36"/>
-          <w:szCs w:val="36"/>
-        </w:rPr>
-        <w:t>ive</w:t>
-      </w:r>
-      <w:r>
-        <w:rPr>
-          <w:sz w:val="36"/>
-          <w:szCs w:val="36"/>
-        </w:rPr>
-        <w:t xml:space="preserve"> values</w:t>
-      </w:r>
-      <w:r>
-        <w:rPr>
-          <w:sz w:val="36"/>
-          <w:szCs w:val="36"/>
-        </w:rPr>
-        <w:t xml:space="preserve"> that it can display</w:t>
-      </w:r>
-      <w:r>
-        <w:rPr>
-          <w:sz w:val="36"/>
-          <w:szCs w:val="36"/>
-        </w:rPr>
-        <w:t>:</w:t>
-      </w:r>
-    </w:p>
-    <w:p>
-      <w:pPr>
-        <w:ind w:left="360"/>
-        <w:jc w:val="both"/>
-        <w:rPr>
-          <w:sz w:val="36"/>
-          <w:szCs w:val="36"/>
-        </w:rPr>
-      </w:pPr>
-      <w:r>
-        <w:rPr>
-          <w:sz w:val="36"/>
-          <w:szCs w:val="36"/>
-        </w:rPr>
-        <w:t>‘</w:t>
-      </w:r>
-      <w:r>
-        <w:rPr>
-          <w:sz w:val="36"/>
-          <w:szCs w:val="36"/>
-        </w:rPr>
-        <w:t>Rapid DC</w:t>
-      </w:r>
-      <w:r>
-        <w:rPr>
-          <w:sz w:val="36"/>
-          <w:szCs w:val="36"/>
-        </w:rPr>
-        <w:t>’</w:t>
-      </w:r>
-      <w:r>
-        <w:rPr>
-          <w:sz w:val="36"/>
-          <w:szCs w:val="36"/>
-        </w:rPr>
-        <w:t xml:space="preserve">, </w:t>
-      </w:r>
-      <w:r>
-        <w:rPr>
-          <w:sz w:val="36"/>
-          <w:szCs w:val="36"/>
-        </w:rPr>
-        <w:t>‘</w:t>
-      </w:r>
-      <w:r>
-        <w:rPr>
-          <w:sz w:val="36"/>
-          <w:szCs w:val="36"/>
-        </w:rPr>
-        <w:t>Fast DC</w:t>
-      </w:r>
-      <w:r>
-        <w:rPr>
-          <w:sz w:val="36"/>
-          <w:szCs w:val="36"/>
-        </w:rPr>
-        <w:t>’</w:t>
-      </w:r>
-      <w:r>
-        <w:rPr>
-          <w:sz w:val="36"/>
-          <w:szCs w:val="36"/>
-        </w:rPr>
-        <w:t xml:space="preserve">, </w:t>
-      </w:r>
-      <w:r>
-        <w:rPr>
-          <w:sz w:val="36"/>
-          <w:szCs w:val="36"/>
-        </w:rPr>
-        <w:t>‘</w:t>
-      </w:r>
-      <w:r>
-        <w:rPr>
-          <w:sz w:val="36"/>
-          <w:szCs w:val="36"/>
-        </w:rPr>
-        <w:t>Fast AC</w:t>
-      </w:r>
-      <w:r>
-        <w:rPr>
-          <w:sz w:val="36"/>
-          <w:szCs w:val="36"/>
-        </w:rPr>
-        <w:t>’ or</w:t>
-      </w:r>
-      <w:r>
-        <w:rPr>
-          <w:sz w:val="36"/>
-          <w:szCs w:val="36"/>
-        </w:rPr>
-        <w:t xml:space="preserve"> </w:t>
-      </w:r>
-      <w:r>
-        <w:rPr>
-          <w:sz w:val="36"/>
-          <w:szCs w:val="36"/>
-        </w:rPr>
-        <w:t>‘</w:t>
-      </w:r>
-      <w:r>
-        <w:rPr>
-          <w:sz w:val="36"/>
-          <w:szCs w:val="36"/>
-        </w:rPr>
-        <w:t>Slow AC</w:t>
-      </w:r>
-      <w:r>
-        <w:rPr>
-          <w:sz w:val="36"/>
-          <w:szCs w:val="36"/>
-        </w:rPr>
-        <w:t xml:space="preserve">’ </w:t>
-      </w:r>
-    </w:p>
-    <w:p>
-      <w:pPr>
-        <w:ind w:left="360"/>
-        <w:jc w:val="both"/>
-        <w:rPr>
-          <w:sz w:val="36"/>
-          <w:szCs w:val="36"/>
-        </w:rPr>
-      </w:pPr>
-      <w:r>
-        <w:rPr>
-          <w:sz w:val="36"/>
-          <w:szCs w:val="36"/>
-        </w:rPr>
-        <w:t>If it cannot determine a value (occasionally this can occur when public charging), it will display “Not Rated” and its icon will change to an alert symbol and turn red.</w:t>
-      </w:r>
-    </w:p>
-    <w:p>
-      <w:pPr>
-        <w:ind w:left="360"/>
-        <w:jc w:val="both"/>
-        <w:rPr>
-          <w:sz w:val="36"/>
-          <w:szCs w:val="36"/>
-        </w:rPr>
-      </w:pPr>
-      <w:r>
-        <w:rPr>
-          <w:sz w:val="36"/>
-          <w:szCs w:val="36"/>
-        </w:rPr>
-        <w:t>Depending on the calculation it makes, will denote the icon colour:</w:t>
-      </w:r>
-    </w:p>
-    <w:p>
-      <w:pPr>
-        <w:ind w:left="360"/>
-        <w:jc w:val="both"/>
-        <w:rPr>
-          <w:sz w:val="36"/>
-          <w:szCs w:val="36"/>
-        </w:rPr>
-      </w:pPr>
-      <w:r>
-        <w:rPr>
-          <w:sz w:val="36"/>
-          <w:szCs w:val="36"/>
-        </w:rPr>
-        <w:t>‘Rapid DC’, green</w:t>
-      </w:r>
-    </w:p>
-    <w:p>
-      <w:pPr>
-        <w:ind w:left="360"/>
-        <w:jc w:val="both"/>
-        <w:rPr>
-          <w:sz w:val="36"/>
-          <w:szCs w:val="36"/>
-        </w:rPr>
-      </w:pPr>
-      <w:r>
-        <w:rPr>
-          <w:sz w:val="36"/>
-          <w:szCs w:val="36"/>
-        </w:rPr>
-        <w:t>‘Fast DC’, orange</w:t>
-      </w:r>
-    </w:p>
-    <w:p>
-      <w:pPr>
-        <w:ind w:left="360"/>
-        <w:jc w:val="both"/>
-        <w:rPr>
-          <w:sz w:val="36"/>
-          <w:szCs w:val="36"/>
-        </w:rPr>
-      </w:pPr>
-      <w:r>
-        <w:rPr>
-          <w:sz w:val="36"/>
-          <w:szCs w:val="36"/>
-        </w:rPr>
-        <w:t>‘Fast AC’ yellow</w:t>
-      </w:r>
-    </w:p>
-    <w:p>
-      <w:pPr>
-        <w:ind w:left="360"/>
-        <w:jc w:val="both"/>
-        <w:rPr>
-          <w:sz w:val="36"/>
-          <w:szCs w:val="36"/>
-        </w:rPr>
-      </w:pPr>
-      <w:r>
-        <w:rPr>
-          <w:sz w:val="36"/>
-          <w:szCs w:val="36"/>
-        </w:rPr>
-        <w:t>‘Slow AC’, red</w:t>
-      </w:r>
-    </w:p>
-    <w:p>
-      <w:pPr>
-        <w:ind w:left="360"/>
-        <w:jc w:val="both"/>
-        <w:rPr>
-          <w:sz w:val="36"/>
-          <w:szCs w:val="36"/>
-        </w:rPr>
-      </w:pPr>
-      <w:r>
-        <w:rPr>
-          <w:sz w:val="36"/>
-          <w:szCs w:val="36"/>
-        </w:rPr>
-        <w:lastRenderedPageBreak/>
-        <w:t>“Status”</w:t>
-      </w:r>
-    </w:p>
-    <w:p>
-      <w:pPr>
-        <w:ind w:left="360"/>
-        <w:jc w:val="both"/>
-        <w:rPr>
-          <w:sz w:val="36"/>
-          <w:szCs w:val="36"/>
-        </w:rPr>
-      </w:pPr>
-      <w:r>
-        <w:rPr>
-          <w:sz w:val="36"/>
-          <w:szCs w:val="36"/>
-        </w:rPr>
-        <w:t>This sensor denotes the end of charge session status and is reported by the API. It should show “Completed” if no errors were detected during the charge or “Failed” if an error was detected or “N/A” if it cannot determine the end of charge status.</w:t>
-      </w:r>
-    </w:p>
-    <w:p>
-      <w:pPr>
-        <w:ind w:left="360"/>
-        <w:jc w:val="both"/>
-        <w:rPr>
-          <w:sz w:val="36"/>
-          <w:szCs w:val="36"/>
-        </w:rPr>
-      </w:pPr>
-      <w:r>
-        <w:rPr>
-          <w:sz w:val="36"/>
-          <w:szCs w:val="36"/>
-        </w:rPr>
-        <w:t xml:space="preserve">“Charge Date” </w:t>
-      </w:r>
-    </w:p>
-    <w:p>
-      <w:pPr>
-        <w:ind w:left="360"/>
-        <w:jc w:val="both"/>
-        <w:rPr>
-          <w:sz w:val="36"/>
-          <w:szCs w:val="36"/>
-        </w:rPr>
-      </w:pPr>
-      <w:r>
-        <w:rPr>
-          <w:sz w:val="36"/>
-          <w:szCs w:val="36"/>
-        </w:rPr>
-        <w:t>Shows the date the start of charge was captured</w:t>
-      </w:r>
-    </w:p>
-    <w:p>
-      <w:pPr>
-        <w:ind w:left="360"/>
-        <w:jc w:val="both"/>
-        <w:rPr>
-          <w:sz w:val="36"/>
-          <w:szCs w:val="36"/>
-        </w:rPr>
-      </w:pPr>
-    </w:p>
-    <w:p>
-      <w:pPr>
-        <w:ind w:left="360"/>
-        <w:jc w:val="both"/>
-        <w:rPr>
-          <w:sz w:val="36"/>
-          <w:szCs w:val="36"/>
-          <w:u w:val="single"/>
-        </w:rPr>
-      </w:pPr>
-      <w:r>
-        <w:rPr>
-          <w:sz w:val="36"/>
-          <w:szCs w:val="36"/>
-          <w:u w:val="single"/>
-        </w:rPr>
-        <w:t>Column 3: “Update/Test/Errors”</w:t>
-      </w:r>
-    </w:p>
-    <w:p>
-      <w:pPr>
-        <w:ind w:left="360"/>
-        <w:jc w:val="both"/>
-        <w:rPr>
-          <w:sz w:val="36"/>
-          <w:szCs w:val="36"/>
-        </w:rPr>
-      </w:pPr>
-      <w:r>
-        <w:rPr>
-          <w:sz w:val="36"/>
-          <w:szCs w:val="36"/>
-        </w:rPr>
-        <w:t>This section is made up of</w:t>
-      </w:r>
-      <w:r>
-        <w:rPr>
-          <w:sz w:val="36"/>
-          <w:szCs w:val="36"/>
-        </w:rPr>
-        <w:t xml:space="preserve"> seven buttons some of which are hidden and only appear conditionally</w:t>
-      </w:r>
-    </w:p>
-    <w:p>
-      <w:pPr>
-        <w:ind w:left="360"/>
-        <w:jc w:val="both"/>
-        <w:rPr>
-          <w:sz w:val="36"/>
-          <w:szCs w:val="36"/>
-        </w:rPr>
-      </w:pPr>
-      <w:r>
-        <w:rPr>
-          <w:sz w:val="36"/>
-          <w:szCs w:val="36"/>
-        </w:rPr>
-        <w:t>“Soft Update”</w:t>
-      </w:r>
-    </w:p>
-    <w:p>
-      <w:pPr>
-        <w:ind w:left="360"/>
-        <w:jc w:val="both"/>
-        <w:rPr>
-          <w:sz w:val="36"/>
-          <w:szCs w:val="36"/>
-        </w:rPr>
-      </w:pPr>
-      <w:r>
-        <w:rPr>
-          <w:sz w:val="36"/>
-          <w:szCs w:val="36"/>
-        </w:rPr>
-        <w:t>This button forces an update of the RAW sensors by calling the Renault API. When you click on it, a pop</w:t>
-      </w:r>
-      <w:r>
-        <w:rPr>
-          <w:sz w:val="36"/>
-          <w:szCs w:val="36"/>
-        </w:rPr>
-        <w:t>-</w:t>
-      </w:r>
-      <w:r>
-        <w:rPr>
-          <w:sz w:val="36"/>
-          <w:szCs w:val="36"/>
-        </w:rPr>
-        <w:t>up dialog appears explaining what a soft update entails and how it works</w:t>
-      </w:r>
-      <w:r>
-        <w:rPr>
-          <w:sz w:val="36"/>
-          <w:szCs w:val="36"/>
-        </w:rPr>
-        <w:t>,</w:t>
-      </w:r>
-      <w:r>
-        <w:rPr>
-          <w:sz w:val="36"/>
-          <w:szCs w:val="36"/>
-        </w:rPr>
-        <w:t xml:space="preserve"> as well as a warning. To execute the update a button will appear in the pop</w:t>
-      </w:r>
-      <w:r>
-        <w:rPr>
-          <w:sz w:val="36"/>
-          <w:szCs w:val="36"/>
-        </w:rPr>
-        <w:t>-</w:t>
-      </w:r>
-      <w:r>
-        <w:rPr>
-          <w:sz w:val="36"/>
-          <w:szCs w:val="36"/>
-        </w:rPr>
-        <w:t xml:space="preserve">up for you to action the update. </w:t>
-      </w:r>
-      <w:proofErr w:type="gramStart"/>
-      <w:r>
-        <w:rPr>
-          <w:sz w:val="36"/>
-          <w:szCs w:val="36"/>
-        </w:rPr>
-        <w:t>Typically</w:t>
-      </w:r>
-      <w:proofErr w:type="gramEnd"/>
-      <w:r>
-        <w:rPr>
-          <w:sz w:val="36"/>
-          <w:szCs w:val="36"/>
-        </w:rPr>
-        <w:t xml:space="preserve"> you might use this if you saw any of the sensors reporting (S) stale data or (D) derived data from cache values.</w:t>
-      </w:r>
-    </w:p>
-    <w:p>
-      <w:pPr>
-        <w:ind w:left="360"/>
-        <w:jc w:val="both"/>
-        <w:rPr>
-          <w:sz w:val="36"/>
-          <w:szCs w:val="36"/>
-        </w:rPr>
-      </w:pPr>
-      <w:r>
-        <w:rPr>
-          <w:sz w:val="36"/>
-          <w:szCs w:val="36"/>
-        </w:rPr>
-        <w:t>“Run Test Charge”</w:t>
-      </w:r>
-    </w:p>
-    <w:p>
-      <w:pPr>
-        <w:ind w:left="360"/>
-        <w:jc w:val="both"/>
-        <w:rPr>
-          <w:sz w:val="36"/>
-          <w:szCs w:val="36"/>
-        </w:rPr>
-      </w:pPr>
-      <w:r>
-        <w:rPr>
-          <w:sz w:val="36"/>
-          <w:szCs w:val="36"/>
-        </w:rPr>
-        <w:t xml:space="preserve">This button will launch a 5 min test charge to prove the logic of the system. Note that it is inhibited during a real charge </w:t>
-      </w:r>
-      <w:r>
-        <w:rPr>
-          <w:sz w:val="36"/>
-          <w:szCs w:val="36"/>
-        </w:rPr>
-        <w:lastRenderedPageBreak/>
-        <w:t>session or once a test charge has started. When you start a test charge the “Last Charge” block of sensors is replaced by another “Test Charge” block of sensors. All will be greyed out with flask icons</w:t>
-      </w:r>
-      <w:r>
-        <w:rPr>
-          <w:sz w:val="36"/>
-          <w:szCs w:val="36"/>
-        </w:rPr>
-        <w:t>,</w:t>
-      </w:r>
-      <w:r>
-        <w:rPr>
-          <w:sz w:val="36"/>
-          <w:szCs w:val="36"/>
-        </w:rPr>
-        <w:t xml:space="preserve"> pulsing in red. Similarly, over in the “Vehicle Status” sensor block, the Charger Plug, Charging Status, Charging Rate, Time Left and Charger Flap sensors will also change icons to a flask and pulse red with their test states displayed (as discussed earlier in this user guide)</w:t>
-      </w:r>
-    </w:p>
-    <w:p>
-      <w:pPr>
-        <w:ind w:left="360"/>
-        <w:jc w:val="both"/>
-        <w:rPr>
-          <w:sz w:val="36"/>
-          <w:szCs w:val="36"/>
-        </w:rPr>
-      </w:pPr>
-      <w:r>
-        <w:rPr>
-          <w:sz w:val="36"/>
-          <w:szCs w:val="36"/>
-        </w:rPr>
-        <w:t>Whilst a test charge is running the button will ch</w:t>
-      </w:r>
-      <w:r>
-        <w:rPr>
-          <w:sz w:val="36"/>
-          <w:szCs w:val="36"/>
-        </w:rPr>
-        <w:t>a</w:t>
-      </w:r>
-      <w:r>
-        <w:rPr>
-          <w:sz w:val="36"/>
-          <w:szCs w:val="36"/>
-        </w:rPr>
-        <w:t xml:space="preserve">nge to an </w:t>
-      </w:r>
-      <w:r>
-        <w:rPr>
-          <w:sz w:val="36"/>
-          <w:szCs w:val="36"/>
-        </w:rPr>
-        <w:t xml:space="preserve">animated </w:t>
-      </w:r>
-      <w:r>
-        <w:rPr>
-          <w:sz w:val="36"/>
-          <w:szCs w:val="36"/>
-        </w:rPr>
-        <w:t>egg timer icon in green, showing the time remaining until the test charge completes. At the end of the test charge</w:t>
-      </w:r>
-      <w:r>
-        <w:rPr>
-          <w:sz w:val="36"/>
-          <w:szCs w:val="36"/>
-        </w:rPr>
-        <w:t>,</w:t>
-      </w:r>
-      <w:r>
-        <w:rPr>
-          <w:sz w:val="36"/>
-          <w:szCs w:val="36"/>
-        </w:rPr>
-        <w:t xml:space="preserve"> all icons will return to their normal </w:t>
-      </w:r>
-      <w:r>
-        <w:rPr>
-          <w:sz w:val="36"/>
-          <w:szCs w:val="36"/>
-        </w:rPr>
-        <w:t xml:space="preserve">type and </w:t>
-      </w:r>
-      <w:r>
-        <w:rPr>
-          <w:sz w:val="36"/>
-          <w:szCs w:val="36"/>
-        </w:rPr>
-        <w:t>colour. The Vehicle Status sensors, will display their original values and the Test Charge values will continue to be displayed for one minute, during which time the egg time</w:t>
-      </w:r>
-      <w:r>
-        <w:rPr>
-          <w:sz w:val="36"/>
-          <w:szCs w:val="36"/>
-        </w:rPr>
-        <w:t>r</w:t>
-      </w:r>
-      <w:r>
-        <w:rPr>
-          <w:sz w:val="36"/>
-          <w:szCs w:val="36"/>
-        </w:rPr>
-        <w:t xml:space="preserve"> button is replaced by an “Auto Reset” button that counts down for 1 minute. At the end of this minute the “Test Charge” card will be replaced by the “Last Charge” card with all the last charge data intact and the Run Test Charge button will reappear.</w:t>
-      </w:r>
-    </w:p>
-    <w:p>
-      <w:pPr>
-        <w:ind w:left="360"/>
-        <w:jc w:val="both"/>
-        <w:rPr>
-          <w:sz w:val="36"/>
-          <w:szCs w:val="36"/>
-        </w:rPr>
-      </w:pPr>
-      <w:r>
-        <w:rPr>
-          <w:sz w:val="36"/>
-          <w:szCs w:val="36"/>
-        </w:rPr>
-        <w:t xml:space="preserve">Note that values generated during the test are partly </w:t>
-      </w:r>
-      <w:r>
-        <w:rPr>
-          <w:sz w:val="36"/>
-          <w:szCs w:val="36"/>
-        </w:rPr>
-        <w:t>captured</w:t>
-      </w:r>
-      <w:r>
-        <w:rPr>
-          <w:sz w:val="36"/>
-          <w:szCs w:val="36"/>
-        </w:rPr>
-        <w:t xml:space="preserve"> and partly fixed notional ones, simply to exercise the logic and ensure everything is working properly, in anticipation of a real charge session. You do NOT need to run the test ordinarily.</w:t>
-      </w:r>
-    </w:p>
-    <w:p>
-      <w:pPr>
-        <w:ind w:left="360"/>
-        <w:jc w:val="both"/>
-        <w:rPr>
-          <w:sz w:val="36"/>
-          <w:szCs w:val="36"/>
-        </w:rPr>
-      </w:pPr>
-      <w:r>
-        <w:rPr>
-          <w:sz w:val="36"/>
-          <w:szCs w:val="36"/>
-        </w:rPr>
-        <w:lastRenderedPageBreak/>
-        <w:t xml:space="preserve">Three further buttons can appear under certain </w:t>
-      </w:r>
-      <w:proofErr w:type="spellStart"/>
-      <w:r>
-        <w:rPr>
-          <w:sz w:val="36"/>
-          <w:szCs w:val="36"/>
-        </w:rPr>
-        <w:t>circimstances</w:t>
-      </w:r>
-      <w:proofErr w:type="spellEnd"/>
-      <w:r>
-        <w:rPr>
-          <w:sz w:val="36"/>
-          <w:szCs w:val="36"/>
-        </w:rPr>
-        <w:t>:</w:t>
-      </w:r>
-    </w:p>
-    <w:p>
-      <w:pPr>
-        <w:ind w:left="360"/>
-        <w:jc w:val="both"/>
-        <w:rPr>
-          <w:sz w:val="36"/>
-          <w:szCs w:val="36"/>
-        </w:rPr>
-      </w:pPr>
-      <w:r>
-        <w:rPr>
-          <w:sz w:val="36"/>
-          <w:szCs w:val="36"/>
-        </w:rPr>
-        <w:t>“CLI Prompt”, “Auth Failure” and “Stale Data”</w:t>
-      </w:r>
-    </w:p>
-    <w:p>
-      <w:pPr>
-        <w:ind w:left="360"/>
-        <w:jc w:val="both"/>
-        <w:rPr>
-          <w:sz w:val="36"/>
-          <w:szCs w:val="36"/>
-        </w:rPr>
-      </w:pPr>
-      <w:r>
-        <w:rPr>
-          <w:sz w:val="36"/>
-          <w:szCs w:val="36"/>
-        </w:rPr>
-        <w:t xml:space="preserve">When an error is </w:t>
-      </w:r>
-      <w:proofErr w:type="gramStart"/>
-      <w:r>
-        <w:rPr>
-          <w:sz w:val="36"/>
-          <w:szCs w:val="36"/>
-        </w:rPr>
-        <w:t>detected</w:t>
-      </w:r>
-      <w:proofErr w:type="gramEnd"/>
-      <w:r>
-        <w:rPr>
-          <w:sz w:val="36"/>
-          <w:szCs w:val="36"/>
-        </w:rPr>
-        <w:t xml:space="preserve"> their state will change to “on” prompting them to become visible. Their icons will be in red and pulsing, denoting there is a problem. You can click on each of them, which will bring up a pop</w:t>
-      </w:r>
-      <w:r>
-        <w:rPr>
-          <w:sz w:val="36"/>
-          <w:szCs w:val="36"/>
-        </w:rPr>
-        <w:t>-</w:t>
-      </w:r>
-      <w:r>
-        <w:rPr>
-          <w:sz w:val="36"/>
-          <w:szCs w:val="36"/>
-        </w:rPr>
-        <w:t xml:space="preserve">up </w:t>
-      </w:r>
-      <w:proofErr w:type="spellStart"/>
-      <w:r>
-        <w:rPr>
-          <w:sz w:val="36"/>
-          <w:szCs w:val="36"/>
-        </w:rPr>
-        <w:t>daialog</w:t>
-      </w:r>
-      <w:proofErr w:type="spellEnd"/>
-      <w:r>
-        <w:rPr>
-          <w:sz w:val="36"/>
-          <w:szCs w:val="36"/>
-        </w:rPr>
-        <w:t xml:space="preserve"> box explaining the cause behind the error and how to deal with it.</w:t>
-      </w:r>
-    </w:p>
-    <w:p>
-      <w:pPr>
-        <w:ind w:left="360"/>
-        <w:jc w:val="both"/>
-        <w:rPr>
-          <w:sz w:val="36"/>
-          <w:szCs w:val="36"/>
-        </w:rPr>
-      </w:pPr>
-    </w:p>
-    <w:p>
-      <w:pPr>
-        <w:ind w:left="360"/>
-        <w:jc w:val="both"/>
-        <w:rPr>
-          <w:sz w:val="36"/>
-          <w:szCs w:val="36"/>
-        </w:rPr>
-      </w:pPr>
-      <w:r>
-        <w:rPr>
-          <w:sz w:val="36"/>
-          <w:szCs w:val="36"/>
-        </w:rPr>
-        <w:t xml:space="preserve">CLI Prompt: denotes that on attempting to retrieve data from Renault’s API to update the RAW </w:t>
-      </w:r>
-      <w:r>
-        <w:rPr>
-          <w:sz w:val="36"/>
-          <w:szCs w:val="36"/>
-        </w:rPr>
-        <w:t>sensors</w:t>
-      </w:r>
-      <w:r>
-        <w:rPr>
-          <w:sz w:val="36"/>
-          <w:szCs w:val="36"/>
-        </w:rPr>
-        <w:t xml:space="preserve"> f</w:t>
-      </w:r>
-      <w:r>
-        <w:rPr>
-          <w:sz w:val="36"/>
-          <w:szCs w:val="36"/>
-        </w:rPr>
-        <w:t>rom</w:t>
-      </w:r>
-      <w:r>
-        <w:rPr>
-          <w:sz w:val="36"/>
-          <w:szCs w:val="36"/>
-        </w:rPr>
-        <w:t xml:space="preserve"> an endpoint, the CLI prompted for interaction, usually a username or </w:t>
-      </w:r>
-      <w:r>
-        <w:rPr>
-          <w:sz w:val="36"/>
-          <w:szCs w:val="36"/>
-        </w:rPr>
-        <w:t>locale</w:t>
-      </w:r>
-      <w:r>
-        <w:rPr>
-          <w:sz w:val="36"/>
-          <w:szCs w:val="36"/>
-        </w:rPr>
-        <w:t xml:space="preserve">. Normally automation </w:t>
-      </w:r>
-      <w:r>
-        <w:rPr>
-          <w:sz w:val="36"/>
-          <w:szCs w:val="36"/>
-        </w:rPr>
-        <w:t>“</w:t>
-      </w:r>
-      <w:r>
-        <w:rPr>
-          <w:sz w:val="36"/>
-          <w:szCs w:val="36"/>
-        </w:rPr>
-        <w:t>8</w:t>
-      </w:r>
-      <w:r>
-        <w:rPr>
-          <w:sz w:val="36"/>
-          <w:szCs w:val="36"/>
-        </w:rPr>
-        <w:t>”</w:t>
-      </w:r>
-      <w:r>
-        <w:rPr>
-          <w:sz w:val="36"/>
-          <w:szCs w:val="36"/>
-        </w:rPr>
-        <w:t xml:space="preserve"> handles this automatically for you, but it might be that you need to run it manually or login into the API yourself via the </w:t>
-      </w:r>
-      <w:r>
-        <w:rPr>
-          <w:sz w:val="36"/>
-          <w:szCs w:val="36"/>
-        </w:rPr>
-        <w:t>“</w:t>
-      </w:r>
-      <w:r>
-        <w:rPr>
-          <w:sz w:val="36"/>
-          <w:szCs w:val="36"/>
-        </w:rPr>
-        <w:t>Advance</w:t>
-      </w:r>
-      <w:r>
-        <w:rPr>
-          <w:sz w:val="36"/>
-          <w:szCs w:val="36"/>
-        </w:rPr>
-        <w:t>d</w:t>
-      </w:r>
-      <w:r>
-        <w:rPr>
-          <w:sz w:val="36"/>
-          <w:szCs w:val="36"/>
-        </w:rPr>
-        <w:t xml:space="preserve"> SSH </w:t>
-      </w:r>
-      <w:r>
-        <w:rPr>
-          <w:sz w:val="36"/>
-          <w:szCs w:val="36"/>
-        </w:rPr>
-        <w:t>&amp;</w:t>
-      </w:r>
-      <w:r>
-        <w:rPr>
-          <w:sz w:val="36"/>
-          <w:szCs w:val="36"/>
-        </w:rPr>
-        <w:t xml:space="preserve"> Web Terminal</w:t>
-      </w:r>
-      <w:r>
-        <w:rPr>
-          <w:sz w:val="36"/>
-          <w:szCs w:val="36"/>
-        </w:rPr>
-        <w:t>”</w:t>
-      </w:r>
-      <w:r>
-        <w:rPr>
-          <w:sz w:val="36"/>
-          <w:szCs w:val="36"/>
-        </w:rPr>
-        <w:t xml:space="preserve"> in Home Assistant</w:t>
-      </w:r>
-      <w:r>
-        <w:rPr>
-          <w:sz w:val="36"/>
-          <w:szCs w:val="36"/>
-        </w:rPr>
-        <w:t xml:space="preserve"> to clear the fault</w:t>
-      </w:r>
-      <w:r>
-        <w:rPr>
-          <w:sz w:val="36"/>
-          <w:szCs w:val="36"/>
-        </w:rPr>
-        <w:t>.</w:t>
-      </w:r>
-    </w:p>
-    <w:p>
-      <w:pPr>
-        <w:ind w:left="360"/>
-        <w:jc w:val="both"/>
-        <w:rPr>
-          <w:sz w:val="36"/>
-          <w:szCs w:val="36"/>
-        </w:rPr>
-      </w:pPr>
-      <w:r>
-        <w:rPr>
-          <w:sz w:val="36"/>
-          <w:szCs w:val="36"/>
-        </w:rPr>
-        <w:t xml:space="preserve">Auth Failure: denotes that authorisation has failed, possibly caused by a corrupt credentials file or some other issue. </w:t>
-      </w:r>
-      <w:proofErr w:type="gramStart"/>
-      <w:r>
-        <w:rPr>
-          <w:sz w:val="36"/>
-          <w:szCs w:val="36"/>
-        </w:rPr>
-        <w:t>Again</w:t>
-      </w:r>
-      <w:proofErr w:type="gramEnd"/>
-      <w:r>
-        <w:rPr>
-          <w:sz w:val="36"/>
-          <w:szCs w:val="36"/>
-        </w:rPr>
-        <w:t xml:space="preserve"> this is usually handled by the automations, but you might need to check your credentials file or reauthenticate yourself via the Terminal.</w:t>
-      </w:r>
-    </w:p>
-    <w:p>
-      <w:pPr>
-        <w:ind w:left="360"/>
-        <w:jc w:val="both"/>
-        <w:rPr>
-          <w:sz w:val="36"/>
-          <w:szCs w:val="36"/>
-        </w:rPr>
-      </w:pPr>
-      <w:r>
-        <w:rPr>
-          <w:sz w:val="36"/>
-          <w:szCs w:val="36"/>
-        </w:rPr>
-        <w:t>Stale Data: This is usually caused by the API lagging for whatever reason</w:t>
-      </w:r>
-      <w:r>
-        <w:rPr>
-          <w:sz w:val="36"/>
-          <w:szCs w:val="36"/>
-        </w:rPr>
-        <w:t>,</w:t>
-      </w:r>
-      <w:r>
-        <w:rPr>
-          <w:sz w:val="36"/>
-          <w:szCs w:val="36"/>
-        </w:rPr>
-        <w:t xml:space="preserve"> in updating the car</w:t>
-      </w:r>
-      <w:r>
-        <w:rPr>
-          <w:sz w:val="36"/>
-          <w:szCs w:val="36"/>
-        </w:rPr>
-        <w:t>’</w:t>
-      </w:r>
-      <w:r>
-        <w:rPr>
-          <w:sz w:val="36"/>
-          <w:szCs w:val="36"/>
-        </w:rPr>
-        <w:t xml:space="preserve">s data. Automations monitor how “fresh” the data is between polling intervals </w:t>
-      </w:r>
-      <w:r>
-        <w:rPr>
-          <w:sz w:val="36"/>
-          <w:szCs w:val="36"/>
-        </w:rPr>
-        <w:lastRenderedPageBreak/>
-        <w:t>and if they appear “stuck</w:t>
-      </w:r>
-      <w:r>
-        <w:rPr>
-          <w:sz w:val="36"/>
-          <w:szCs w:val="36"/>
-        </w:rPr>
-        <w:t>”</w:t>
-      </w:r>
-      <w:r>
-        <w:rPr>
-          <w:sz w:val="36"/>
-          <w:szCs w:val="36"/>
-        </w:rPr>
-        <w:t xml:space="preserve"> for a pre-determined time, then it prompts a refresh and invokes this condition causing the button to appear.</w:t>
+        <w:t>W</w:t>
+      </w:r>
+      <w:r>
+        <w:rPr>
+          <w:sz w:val="36"/>
+          <w:szCs w:val="36"/>
+        </w:rPr>
+        <w:t>hen an active charge session takes place, the main car image in the “Vehicle Status” section, is automatically replaced by a charge indicator, that dynamically displays the charge level (Current SOC) and the charge limits set (Min/Target SOC). Once charging has ended, the card disappears and the main car image replaces it.</w:t>
+      </w:r>
+    </w:p>
+    <w:bookmarkEnd w:id="0"/>
+    <w:p>
+      <w:pPr>
+        <w:ind w:left="360"/>
+        <w:jc w:val="both"/>
+        <w:rPr>
+          <w:sz w:val="36"/>
+          <w:szCs w:val="36"/>
+        </w:rPr>
+      </w:pPr>
+    </w:p>
+    <w:p>
+      <w:pPr>
+        <w:ind w:left="360"/>
+        <w:jc w:val="center"/>
+        <w:rPr>
+          <w:sz w:val="36"/>
+          <w:szCs w:val="36"/>
+        </w:rPr>
+      </w:pPr>
+      <w:r>
+        <w:rPr>
+          <w:noProof/>
+          <w:sz w:val="36"/>
+          <w:szCs w:val="36"/>
+        </w:rPr>
+        <w:drawing>
+          <wp:inline distT="0" distB="0" distL="0" distR="0" wp14:anchorId="079C3F40" wp14:editId="6CF5B4F7">
+            <wp:extent cx="2924175" cy="1637790"/>
+            <wp:effectExtent l="0" t="0" r="0" b="635"/>
+            <wp:docPr id="1800381069" name="Picture 1"/>
+            <wp:cNvGraphicFramePr>
+              <a:graphicFrameLocks xmlns:a="http://schemas.openxmlformats.org/drawingml/2006/main" noChangeAspect="1"/>
+            </wp:cNvGraphicFramePr>
+            <a:graphic xmlns:a="http://schemas.openxmlformats.org/drawingml/2006/main">
+              <a:graphicData uri="http://schemas.openxmlformats.org/drawingml/2006/picture">
+                <pic:pic xmlns:pic="http://schemas.openxmlformats.org/drawingml/2006/picture">
+                  <pic:nvPicPr>
+                    <pic:cNvPr id="1800381069" name="Picture 1800381069"/>
+                    <pic:cNvPicPr/>
+                  </pic:nvPicPr>
+                  <pic:blipFill>
+                    <a:blip r:embed="rId6">
+                      <a:extLst>
+                        <a:ext uri="{28A0092B-C50C-407E-A947-70E740481C1C}">
+                          <a14:useLocalDpi xmlns:a14="http://schemas.microsoft.com/office/drawing/2010/main" val="0"/>
+                        </a:ext>
+                      </a:extLst>
+                    </a:blip>
+                    <a:stretch>
+                      <a:fillRect/>
+                    </a:stretch>
+                  </pic:blipFill>
+                  <pic:spPr>
+                    <a:xfrm>
+                      <a:off x="0" y="0"/>
+                      <a:ext cx="2938458" cy="1645790"/>
+                    </a:xfrm>
+                    <a:prstGeom prst="rect">
+                      <a:avLst/>
+                    </a:prstGeom>
+                  </pic:spPr>
+                </pic:pic>
+              </a:graphicData>
+            </a:graphic>
+          </wp:inline>
+        </w:drawing>
       </w:r>
     </w:p>
     <w:p>
@@ -8036,6 +8302,95 @@
     </w:lvl>
   </w:abstractNum>
   <w:abstractNum w:abstractNumId="20" w15:restartNumberingAfterBreak="0">
+    <w:nsid w:val="5A441EEB"/>
+    <w:multiLevelType w:val="hybridMultilevel"/>
+    <w:tmpl w:val="534AC878"/>
+    <w:lvl w:ilvl="0" w:tplc="0809000F">
+      <w:start w:val="1"/>
+      <w:numFmt w:val="decimal"/>
+      <w:lvlText w:val="%1."/>
+      <w:lvlJc w:val="left"/>
+      <w:pPr>
+        <w:ind w:left="720" w:hanging="360"/>
+      </w:pPr>
+      <w:rPr>
+        <w:rFonts w:hint="default"/>
+      </w:rPr>
+    </w:lvl>
+    <w:lvl w:ilvl="1" w:tplc="08090019" w:tentative="1">
+      <w:start w:val="1"/>
+      <w:numFmt w:val="lowerLetter"/>
+      <w:lvlText w:val="%2."/>
+      <w:lvlJc w:val="left"/>
+      <w:pPr>
+        <w:ind w:left="1440" w:hanging="360"/>
+      </w:pPr>
+    </w:lvl>
+    <w:lvl w:ilvl="2" w:tplc="0809001B" w:tentative="1">
+      <w:start w:val="1"/>
+      <w:numFmt w:val="lowerRoman"/>
+      <w:lvlText w:val="%3."/>
+      <w:lvlJc w:val="right"/>
+      <w:pPr>
+        <w:ind w:left="2160" w:hanging="180"/>
+      </w:pPr>
+    </w:lvl>
+    <w:lvl w:ilvl="3" w:tplc="0809000F" w:tentative="1">
+      <w:start w:val="1"/>
+      <w:numFmt w:val="decimal"/>
+      <w:lvlText w:val="%4."/>
+      <w:lvlJc w:val="left"/>
+      <w:pPr>
+        <w:ind w:left="2880" w:hanging="360"/>
+      </w:pPr>
+    </w:lvl>
+    <w:lvl w:ilvl="4" w:tplc="08090019" w:tentative="1">
+      <w:start w:val="1"/>
+      <w:numFmt w:val="lowerLetter"/>
+      <w:lvlText w:val="%5."/>
+      <w:lvlJc w:val="left"/>
+      <w:pPr>
+        <w:ind w:left="3600" w:hanging="360"/>
+      </w:pPr>
+    </w:lvl>
+    <w:lvl w:ilvl="5" w:tplc="0809001B" w:tentative="1">
+      <w:start w:val="1"/>
+      <w:numFmt w:val="lowerRoman"/>
+      <w:lvlText w:val="%6."/>
+      <w:lvlJc w:val="right"/>
+      <w:pPr>
+        <w:ind w:left="4320" w:hanging="180"/>
+      </w:pPr>
+    </w:lvl>
+    <w:lvl w:ilvl="6" w:tplc="0809000F" w:tentative="1">
+      <w:start w:val="1"/>
+      <w:numFmt w:val="decimal"/>
+      <w:lvlText w:val="%7."/>
+      <w:lvlJc w:val="left"/>
+      <w:pPr>
+        <w:ind w:left="5040" w:hanging="360"/>
+      </w:pPr>
+    </w:lvl>
+    <w:lvl w:ilvl="7" w:tplc="08090019" w:tentative="1">
+      <w:start w:val="1"/>
+      <w:numFmt w:val="lowerLetter"/>
+      <w:lvlText w:val="%8."/>
+      <w:lvlJc w:val="left"/>
+      <w:pPr>
+        <w:ind w:left="5760" w:hanging="360"/>
+      </w:pPr>
+    </w:lvl>
+    <w:lvl w:ilvl="8" w:tplc="0809001B" w:tentative="1">
+      <w:start w:val="1"/>
+      <w:numFmt w:val="lowerRoman"/>
+      <w:lvlText w:val="%9."/>
+      <w:lvlJc w:val="right"/>
+      <w:pPr>
+        <w:ind w:left="6480" w:hanging="180"/>
+      </w:pPr>
+    </w:lvl>
+  </w:abstractNum>
+  <w:abstractNum w:abstractNumId="21" w15:restartNumberingAfterBreak="0">
     <w:nsid w:val="637D7665"/>
     <w:multiLevelType w:val="hybridMultilevel"/>
     <w:tmpl w:val="9F10A802"/>
@@ -8148,7 +8503,7 @@
       </w:rPr>
     </w:lvl>
   </w:abstractNum>
-  <w:abstractNum w:abstractNumId="21" w15:restartNumberingAfterBreak="0">
+  <w:abstractNum w:abstractNumId="22" w15:restartNumberingAfterBreak="0">
     <w:nsid w:val="641B3E1E"/>
     <w:multiLevelType w:val="multilevel"/>
     <w:tmpl w:val="7F125D7E"/>
@@ -8297,7 +8652,7 @@
       </w:rPr>
     </w:lvl>
   </w:abstractNum>
-  <w:abstractNum w:abstractNumId="22" w15:restartNumberingAfterBreak="0">
+  <w:abstractNum w:abstractNumId="23" w15:restartNumberingAfterBreak="0">
     <w:nsid w:val="64A018F2"/>
     <w:multiLevelType w:val="multilevel"/>
     <w:tmpl w:val="84A094AC"/>
@@ -8410,7 +8765,7 @@
       </w:pPr>
     </w:lvl>
   </w:abstractNum>
-  <w:abstractNum w:abstractNumId="23" w15:restartNumberingAfterBreak="0">
+  <w:abstractNum w:abstractNumId="24" w15:restartNumberingAfterBreak="0">
     <w:nsid w:val="69D156E5"/>
     <w:multiLevelType w:val="multilevel"/>
     <w:tmpl w:val="9462FB66"/>
@@ -8559,7 +8914,95 @@
       </w:rPr>
     </w:lvl>
   </w:abstractNum>
-  <w:abstractNum w:abstractNumId="24" w15:restartNumberingAfterBreak="0">
+  <w:abstractNum w:abstractNumId="25" w15:restartNumberingAfterBreak="0">
+    <w:nsid w:val="6C566714"/>
+    <w:multiLevelType w:val="hybridMultilevel"/>
+    <w:tmpl w:val="ADFAF65E"/>
+    <w:lvl w:ilvl="0" w:tplc="0809000F">
+      <w:numFmt w:val="decimal"/>
+      <w:lvlText w:val="%1."/>
+      <w:lvlJc w:val="left"/>
+      <w:pPr>
+        <w:ind w:left="720" w:hanging="360"/>
+      </w:pPr>
+      <w:rPr>
+        <w:rFonts w:hint="default"/>
+      </w:rPr>
+    </w:lvl>
+    <w:lvl w:ilvl="1" w:tplc="08090019" w:tentative="1">
+      <w:start w:val="1"/>
+      <w:numFmt w:val="lowerLetter"/>
+      <w:lvlText w:val="%2."/>
+      <w:lvlJc w:val="left"/>
+      <w:pPr>
+        <w:ind w:left="1440" w:hanging="360"/>
+      </w:pPr>
+    </w:lvl>
+    <w:lvl w:ilvl="2" w:tplc="0809001B" w:tentative="1">
+      <w:start w:val="1"/>
+      <w:numFmt w:val="lowerRoman"/>
+      <w:lvlText w:val="%3."/>
+      <w:lvlJc w:val="right"/>
+      <w:pPr>
+        <w:ind w:left="2160" w:hanging="180"/>
+      </w:pPr>
+    </w:lvl>
+    <w:lvl w:ilvl="3" w:tplc="0809000F" w:tentative="1">
+      <w:start w:val="1"/>
+      <w:numFmt w:val="decimal"/>
+      <w:lvlText w:val="%4."/>
+      <w:lvlJc w:val="left"/>
+      <w:pPr>
+        <w:ind w:left="2880" w:hanging="360"/>
+      </w:pPr>
+    </w:lvl>
+    <w:lvl w:ilvl="4" w:tplc="08090019" w:tentative="1">
+      <w:start w:val="1"/>
+      <w:numFmt w:val="lowerLetter"/>
+      <w:lvlText w:val="%5."/>
+      <w:lvlJc w:val="left"/>
+      <w:pPr>
+        <w:ind w:left="3600" w:hanging="360"/>
+      </w:pPr>
+    </w:lvl>
+    <w:lvl w:ilvl="5" w:tplc="0809001B" w:tentative="1">
+      <w:start w:val="1"/>
+      <w:numFmt w:val="lowerRoman"/>
+      <w:lvlText w:val="%6."/>
+      <w:lvlJc w:val="right"/>
+      <w:pPr>
+        <w:ind w:left="4320" w:hanging="180"/>
+      </w:pPr>
+    </w:lvl>
+    <w:lvl w:ilvl="6" w:tplc="0809000F" w:tentative="1">
+      <w:start w:val="1"/>
+      <w:numFmt w:val="decimal"/>
+      <w:lvlText w:val="%7."/>
+      <w:lvlJc w:val="left"/>
+      <w:pPr>
+        <w:ind w:left="5040" w:hanging="360"/>
+      </w:pPr>
+    </w:lvl>
+    <w:lvl w:ilvl="7" w:tplc="08090019" w:tentative="1">
+      <w:start w:val="1"/>
+      <w:numFmt w:val="lowerLetter"/>
+      <w:lvlText w:val="%8."/>
+      <w:lvlJc w:val="left"/>
+      <w:pPr>
+        <w:ind w:left="5760" w:hanging="360"/>
+      </w:pPr>
+    </w:lvl>
+    <w:lvl w:ilvl="8" w:tplc="0809001B" w:tentative="1">
+      <w:start w:val="1"/>
+      <w:numFmt w:val="lowerRoman"/>
+      <w:lvlText w:val="%9."/>
+      <w:lvlJc w:val="right"/>
+      <w:pPr>
+        <w:ind w:left="6480" w:hanging="180"/>
+      </w:pPr>
+    </w:lvl>
+  </w:abstractNum>
+  <w:abstractNum w:abstractNumId="26" w15:restartNumberingAfterBreak="0">
     <w:nsid w:val="6FE90673"/>
     <w:multiLevelType w:val="multilevel"/>
     <w:tmpl w:val="2556BCC4"/>
@@ -8708,7 +9151,7 @@
       </w:rPr>
     </w:lvl>
   </w:abstractNum>
-  <w:abstractNum w:abstractNumId="25" w15:restartNumberingAfterBreak="0">
+  <w:abstractNum w:abstractNumId="27" w15:restartNumberingAfterBreak="0">
     <w:nsid w:val="70857369"/>
     <w:multiLevelType w:val="multilevel"/>
     <w:tmpl w:val="9CEEC63A"/>
@@ -8828,7 +9271,7 @@
     <w:abstractNumId w:val="16"/>
   </w:num>
   <w:num w:numId="3" w16cid:durableId="349140624">
-    <w:abstractNumId w:val="23"/>
+    <w:abstractNumId w:val="24"/>
   </w:num>
   <w:num w:numId="4" w16cid:durableId="1219433887">
     <w:abstractNumId w:val="9"/>
@@ -8846,10 +9289,10 @@
     <w:abstractNumId w:val="18"/>
   </w:num>
   <w:num w:numId="9" w16cid:durableId="329259768">
-    <w:abstractNumId w:val="22"/>
+    <w:abstractNumId w:val="23"/>
   </w:num>
   <w:num w:numId="10" w16cid:durableId="542257941">
-    <w:abstractNumId w:val="21"/>
+    <w:abstractNumId w:val="22"/>
   </w:num>
   <w:num w:numId="11" w16cid:durableId="337122084">
     <w:abstractNumId w:val="2"/>
@@ -8858,7 +9301,7 @@
     <w:abstractNumId w:val="6"/>
   </w:num>
   <w:num w:numId="13" w16cid:durableId="407728028">
-    <w:abstractNumId w:val="25"/>
+    <w:abstractNumId w:val="27"/>
   </w:num>
   <w:num w:numId="14" w16cid:durableId="1384328493">
     <w:abstractNumId w:val="3"/>
@@ -8873,7 +9316,7 @@
     <w:abstractNumId w:val="12"/>
   </w:num>
   <w:num w:numId="18" w16cid:durableId="403529312">
-    <w:abstractNumId w:val="24"/>
+    <w:abstractNumId w:val="26"/>
   </w:num>
   <w:num w:numId="19" w16cid:durableId="820732363">
     <w:abstractNumId w:val="14"/>
@@ -8882,7 +9325,7 @@
     <w:abstractNumId w:val="8"/>
   </w:num>
   <w:num w:numId="21" w16cid:durableId="76294685">
-    <w:abstractNumId w:val="20"/>
+    <w:abstractNumId w:val="21"/>
   </w:num>
   <w:num w:numId="22" w16cid:durableId="167329264">
     <w:abstractNumId w:val="19"/>
@@ -8898,6 +9341,12 @@
   </w:num>
   <w:num w:numId="26" w16cid:durableId="1735812994">
     <w:abstractNumId w:val="4"/>
+  </w:num>
+  <w:num w:numId="27" w16cid:durableId="1291782228">
+    <w:abstractNumId w:val="20"/>
+  </w:num>
+  <w:num w:numId="28" w16cid:durableId="1519002738">
+    <w:abstractNumId w:val="25"/>
   </w:num>
 </w:numbering>
 </file>

</xml_diff>